<commit_message>
docs(experience): polish Hypervisor vocabulary for COMEX readers
Rewrite the Hypervisor pack so a COMEX or métier reader can follow
without an Agentium background: shared ten-word glossary, avis vs
appliquer, droits instead of IAM, and technical notes kept as footnotes.

Co-authored-by: thibaud.ishacian <thibaud.ishacian@gmail.com>
</commit_message>
<xml_diff>
--- a/docs/agentium-hypervisor-decision-strategy.en.docx
+++ b/docs/agentium-hypervisor-decision-strategy.en.docx
@@ -388,6 +388,702 @@
           <w:b w:val="0"/>
           <w:i/>
           <w:color w:val="596371"/>
+          <w:sz w:val="22"/>
+        </w:rPr>
+        <w:t>.</w:t>
+      </w:r>
+    </w:p>
+    <w:p>
+      <w:r>
+        <w:rPr>
+          <w:rFonts w:ascii="Calibri" w:hAnsi="Calibri" w:eastAsia="Calibri"/>
+          <w:b w:val="0"/>
+          <w:i w:val="0"/>
+          <w:color w:val="151A23"/>
+          <w:sz w:val="22"/>
+        </w:rPr>
+        <w:t>&gt;</w:t>
+      </w:r>
+    </w:p>
+    <w:p>
+      <w:pPr>
+        <w:ind w:left="340"/>
+      </w:pPr>
+      <w:r>
+        <w:rPr>
+          <w:rFonts w:ascii="Calibri" w:hAnsi="Calibri" w:eastAsia="Calibri"/>
+          <w:b w:val="0"/>
+          <w:i/>
+          <w:color w:val="596371"/>
+          <w:sz w:val="22"/>
+        </w:rPr>
+        <w:t xml:space="preserve">User stories: </w:t>
+      </w:r>
+      <w:r>
+        <w:rPr>
+          <w:rFonts w:ascii="Calibri" w:hAnsi="Calibri" w:eastAsia="Calibri"/>
+          <w:b w:val="0"/>
+          <w:i/>
+          <w:color w:val="596371"/>
+          <w:sz w:val="22"/>
+        </w:rPr>
+        <w:t>`agentium-hypervisor-user-stories.en.md`</w:t>
+      </w:r>
+      <w:r>
+        <w:rPr>
+          <w:rFonts w:ascii="Calibri" w:hAnsi="Calibri" w:eastAsia="Calibri"/>
+          <w:b w:val="0"/>
+          <w:i/>
+          <w:color w:val="596371"/>
+          <w:sz w:val="22"/>
+        </w:rPr>
+        <w:t xml:space="preserve">. COMEX MVP: </w:t>
+      </w:r>
+      <w:r>
+        <w:rPr>
+          <w:rFonts w:ascii="Calibri" w:hAnsi="Calibri" w:eastAsia="Calibri"/>
+          <w:b w:val="0"/>
+          <w:i/>
+          <w:color w:val="596371"/>
+          <w:sz w:val="22"/>
+        </w:rPr>
+        <w:t>`agentium-hypervisor-mvp-comex.en.md`</w:t>
+      </w:r>
+      <w:r>
+        <w:rPr>
+          <w:rFonts w:ascii="Calibri" w:hAnsi="Calibri" w:eastAsia="Calibri"/>
+          <w:b w:val="0"/>
+          <w:i/>
+          <w:color w:val="596371"/>
+          <w:sz w:val="22"/>
+        </w:rPr>
+        <w:t>.</w:t>
+      </w:r>
+    </w:p>
+    <w:p>
+      <w:r>
+        <w:rPr>
+          <w:rFonts w:ascii="Calibri" w:hAnsi="Calibri" w:eastAsia="Calibri"/>
+          <w:b w:val="0"/>
+          <w:i w:val="0"/>
+          <w:color w:val="151A23"/>
+          <w:sz w:val="22"/>
+        </w:rPr>
+        <w:t>How to read: the glossary and §§1–3 are enough for a COMEX. Routes, switches and API excerpts are notes for whoever prepares a demo or implements — skip them.</w:t>
+      </w:r>
+    </w:p>
+    <w:p>
+      <w:r>
+        <w:rPr>
+          <w:rFonts w:ascii="Calibri" w:hAnsi="Calibri" w:eastAsia="Calibri"/>
+          <w:b w:val="0"/>
+          <w:i w:val="0"/>
+          <w:color w:val="151A23"/>
+          <w:sz w:val="22"/>
+        </w:rPr>
+        <w:t>---</w:t>
+      </w:r>
+    </w:p>
+    <w:p>
+      <w:pPr>
+        <w:pStyle w:val="Heading2"/>
+      </w:pPr>
+      <w:r>
+        <w:rPr>
+          <w:rFonts w:ascii="Calibri" w:hAnsi="Calibri" w:eastAsia="Calibri"/>
+          <w:b/>
+          <w:i w:val="0"/>
+          <w:color w:val="0B2545"/>
+          <w:sz w:val="32"/>
+        </w:rPr>
+        <w:t>0. Ten words</w:t>
+      </w:r>
+    </w:p>
+    <w:tbl>
+      <w:tblPr>
+        <w:tblStyle w:val="TableGrid"/>
+        <w:tblW w:type="auto" w:w="0"/>
+        <w:tblLook w:firstColumn="1" w:firstRow="1" w:lastColumn="0" w:lastRow="0" w:noHBand="0" w:noVBand="1" w:val="04A0"/>
+      </w:tblPr>
+      <w:tblGrid>
+        <w:gridCol w:w="4873"/>
+        <w:gridCol w:w="4873"/>
+      </w:tblGrid>
+      <w:tr>
+        <w:tc>
+          <w:tcPr>
+            <w:tcW w:type="dxa" w:w="4873"/>
+          </w:tcPr>
+          <w:p>
+            <w:r>
+              <w:rPr>
+                <w:rFonts w:ascii="Calibri" w:hAnsi="Calibri" w:eastAsia="Calibri"/>
+                <w:b/>
+                <w:i w:val="0"/>
+                <w:color w:val="0B2545"/>
+                <w:sz w:val="18"/>
+              </w:rPr>
+              <w:t>Word</w:t>
+            </w:r>
+          </w:p>
+        </w:tc>
+        <w:tc>
+          <w:tcPr>
+            <w:tcW w:type="dxa" w:w="4873"/>
+          </w:tcPr>
+          <w:p>
+            <w:r>
+              <w:rPr>
+                <w:rFonts w:ascii="Calibri" w:hAnsi="Calibri" w:eastAsia="Calibri"/>
+                <w:b/>
+                <w:i w:val="0"/>
+                <w:color w:val="0B2545"/>
+                <w:sz w:val="18"/>
+              </w:rPr>
+              <w:t>Plain meaning</w:t>
+            </w:r>
+          </w:p>
+        </w:tc>
+      </w:tr>
+      <w:tr>
+        <w:tc>
+          <w:tcPr>
+            <w:tcW w:type="dxa" w:w="4873"/>
+          </w:tcPr>
+          <w:p>
+            <w:r>
+              <w:rPr>
+                <w:rFonts w:ascii="Calibri" w:hAnsi="Calibri" w:eastAsia="Calibri"/>
+                <w:b/>
+                <w:i w:val="0"/>
+                <w:color w:val="151A23"/>
+                <w:sz w:val="18"/>
+              </w:rPr>
+              <w:t>System</w:t>
+            </w:r>
+          </w:p>
+        </w:tc>
+        <w:tc>
+          <w:tcPr>
+            <w:tcW w:type="dxa" w:w="4873"/>
+          </w:tcPr>
+          <w:p>
+            <w:r>
+              <w:rPr>
+                <w:rFonts w:ascii="Calibri" w:hAnsi="Calibri" w:eastAsia="Calibri"/>
+                <w:b w:val="0"/>
+                <w:i w:val="0"/>
+                <w:color w:val="151A23"/>
+                <w:sz w:val="18"/>
+              </w:rPr>
+              <w:t>An industrialized AI system: a business objective, rules, a way to run. Not a chat.</w:t>
+            </w:r>
+          </w:p>
+        </w:tc>
+      </w:tr>
+      <w:tr>
+        <w:tc>
+          <w:tcPr>
+            <w:tcW w:type="dxa" w:w="4873"/>
+          </w:tcPr>
+          <w:p>
+            <w:r>
+              <w:rPr>
+                <w:rFonts w:ascii="Calibri" w:hAnsi="Calibri" w:eastAsia="Calibri"/>
+                <w:b/>
+                <w:i w:val="0"/>
+                <w:color w:val="151A23"/>
+                <w:sz w:val="18"/>
+              </w:rPr>
+              <w:t>Run</w:t>
+            </w:r>
+          </w:p>
+        </w:tc>
+        <w:tc>
+          <w:tcPr>
+            <w:tcW w:type="dxa" w:w="4873"/>
+          </w:tcPr>
+          <w:p>
+            <w:r>
+              <w:rPr>
+                <w:rFonts w:ascii="Calibri" w:hAnsi="Calibri" w:eastAsia="Calibri"/>
+                <w:b w:val="0"/>
+                <w:i w:val="0"/>
+                <w:color w:val="151A23"/>
+                <w:sz w:val="18"/>
+              </w:rPr>
+              <w:t>One traced execution. Completed ≠ validated answer ≠ money gained.</w:t>
+            </w:r>
+          </w:p>
+        </w:tc>
+      </w:tr>
+      <w:tr>
+        <w:tc>
+          <w:tcPr>
+            <w:tcW w:type="dxa" w:w="4873"/>
+          </w:tcPr>
+          <w:p>
+            <w:r>
+              <w:rPr>
+                <w:rFonts w:ascii="Calibri" w:hAnsi="Calibri" w:eastAsia="Calibri"/>
+                <w:b/>
+                <w:i w:val="0"/>
+                <w:color w:val="151A23"/>
+                <w:sz w:val="18"/>
+              </w:rPr>
+              <w:t>Work</w:t>
+            </w:r>
+          </w:p>
+        </w:tc>
+        <w:tc>
+          <w:tcPr>
+            <w:tcW w:type="dxa" w:w="4873"/>
+          </w:tcPr>
+          <w:p>
+            <w:r>
+              <w:rPr>
+                <w:rFonts w:ascii="Calibri" w:hAnsi="Calibri" w:eastAsia="Calibri"/>
+                <w:b w:val="0"/>
+                <w:i w:val="0"/>
+                <w:color w:val="151A23"/>
+                <w:sz w:val="18"/>
+              </w:rPr>
+              <w:t>Where the business does the work, in a published application.</w:t>
+            </w:r>
+          </w:p>
+        </w:tc>
+      </w:tr>
+      <w:tr>
+        <w:tc>
+          <w:tcPr>
+            <w:tcW w:type="dxa" w:w="4873"/>
+          </w:tcPr>
+          <w:p>
+            <w:r>
+              <w:rPr>
+                <w:rFonts w:ascii="Calibri" w:hAnsi="Calibri" w:eastAsia="Calibri"/>
+                <w:b/>
+                <w:i w:val="0"/>
+                <w:color w:val="151A23"/>
+                <w:sz w:val="18"/>
+              </w:rPr>
+              <w:t>Studio</w:t>
+            </w:r>
+          </w:p>
+        </w:tc>
+        <w:tc>
+          <w:tcPr>
+            <w:tcW w:type="dxa" w:w="4873"/>
+          </w:tcPr>
+          <w:p>
+            <w:r>
+              <w:rPr>
+                <w:rFonts w:ascii="Calibri" w:hAnsi="Calibri" w:eastAsia="Calibri"/>
+                <w:b w:val="0"/>
+                <w:i w:val="0"/>
+                <w:color w:val="151A23"/>
+                <w:sz w:val="18"/>
+              </w:rPr>
+              <w:t>The screen of that application: follow, and approve when asked.</w:t>
+            </w:r>
+          </w:p>
+        </w:tc>
+      </w:tr>
+      <w:tr>
+        <w:tc>
+          <w:tcPr>
+            <w:tcW w:type="dxa" w:w="4873"/>
+          </w:tcPr>
+          <w:p>
+            <w:r>
+              <w:rPr>
+                <w:rFonts w:ascii="Calibri" w:hAnsi="Calibri" w:eastAsia="Calibri"/>
+                <w:b/>
+                <w:i w:val="0"/>
+                <w:color w:val="151A23"/>
+                <w:sz w:val="18"/>
+              </w:rPr>
+              <w:t>Cockpit</w:t>
+            </w:r>
+          </w:p>
+        </w:tc>
+        <w:tc>
+          <w:tcPr>
+            <w:tcW w:type="dxa" w:w="4873"/>
+          </w:tcPr>
+          <w:p>
+            <w:r>
+              <w:rPr>
+                <w:rFonts w:ascii="Calibri" w:hAnsi="Calibri" w:eastAsia="Calibri"/>
+                <w:b w:val="0"/>
+                <w:i w:val="0"/>
+                <w:color w:val="151A23"/>
+                <w:sz w:val="18"/>
+              </w:rPr>
+              <w:t>Where people build, follow, improve and administer Systems.</w:t>
+            </w:r>
+          </w:p>
+        </w:tc>
+      </w:tr>
+      <w:tr>
+        <w:tc>
+          <w:tcPr>
+            <w:tcW w:type="dxa" w:w="4873"/>
+          </w:tcPr>
+          <w:p>
+            <w:r>
+              <w:rPr>
+                <w:rFonts w:ascii="Calibri" w:hAnsi="Calibri" w:eastAsia="Calibri"/>
+                <w:b/>
+                <w:i w:val="0"/>
+                <w:color w:val="151A23"/>
+                <w:sz w:val="18"/>
+              </w:rPr>
+              <w:t>Hypervisor / Impact</w:t>
+            </w:r>
+          </w:p>
+        </w:tc>
+        <w:tc>
+          <w:tcPr>
+            <w:tcW w:type="dxa" w:w="4873"/>
+          </w:tcPr>
+          <w:p>
+            <w:r>
+              <w:rPr>
+                <w:rFonts w:ascii="Calibri" w:hAnsi="Calibri" w:eastAsia="Calibri"/>
+                <w:b w:val="0"/>
+                <w:i w:val="0"/>
+                <w:color w:val="151A23"/>
+                <w:sz w:val="18"/>
+              </w:rPr>
+              <w:t xml:space="preserve">The portfolio </w:t>
+            </w:r>
+            <w:r>
+              <w:rPr>
+                <w:rFonts w:ascii="Calibri" w:hAnsi="Calibri" w:eastAsia="Calibri"/>
+                <w:b/>
+                <w:i w:val="0"/>
+                <w:color w:val="151A23"/>
+                <w:sz w:val="18"/>
+              </w:rPr>
+              <w:t>ledger</w:t>
+            </w:r>
+            <w:r>
+              <w:rPr>
+                <w:rFonts w:ascii="Calibri" w:hAnsi="Calibri" w:eastAsia="Calibri"/>
+                <w:b w:val="0"/>
+                <w:i w:val="0"/>
+                <w:color w:val="151A23"/>
+                <w:sz w:val="18"/>
+              </w:rPr>
+              <w:t>: what already ran. Not the live operations room.</w:t>
+            </w:r>
+          </w:p>
+        </w:tc>
+      </w:tr>
+      <w:tr>
+        <w:tc>
+          <w:tcPr>
+            <w:tcW w:type="dxa" w:w="4873"/>
+          </w:tcPr>
+          <w:p>
+            <w:r>
+              <w:rPr>
+                <w:rFonts w:ascii="Calibri" w:hAnsi="Calibri" w:eastAsia="Calibri"/>
+                <w:b/>
+                <w:i w:val="0"/>
+                <w:color w:val="151A23"/>
+                <w:sz w:val="18"/>
+              </w:rPr>
+              <w:t>Decision</w:t>
+            </w:r>
+          </w:p>
+        </w:tc>
+        <w:tc>
+          <w:tcPr>
+            <w:tcW w:type="dxa" w:w="4873"/>
+          </w:tcPr>
+          <w:p>
+            <w:r>
+              <w:rPr>
+                <w:rFonts w:ascii="Calibri" w:hAnsi="Calibri" w:eastAsia="Calibri"/>
+                <w:b w:val="0"/>
+                <w:i w:val="0"/>
+                <w:color w:val="151A23"/>
+                <w:sz w:val="18"/>
+              </w:rPr>
+              <w:t xml:space="preserve">A human opinion (accept / reject). In the Hypervisor this </w:t>
+            </w:r>
+            <w:r>
+              <w:rPr>
+                <w:rFonts w:ascii="Calibri" w:hAnsi="Calibri" w:eastAsia="Calibri"/>
+                <w:b/>
+                <w:i w:val="0"/>
+                <w:color w:val="151A23"/>
+                <w:sz w:val="18"/>
+              </w:rPr>
+              <w:t>records</w:t>
+            </w:r>
+            <w:r>
+              <w:rPr>
+                <w:rFonts w:ascii="Calibri" w:hAnsi="Calibri" w:eastAsia="Calibri"/>
+                <w:b w:val="0"/>
+                <w:i w:val="0"/>
+                <w:color w:val="151A23"/>
+                <w:sz w:val="18"/>
+              </w:rPr>
+              <w:t xml:space="preserve"> the opinion. It does not apply the change.</w:t>
+            </w:r>
+          </w:p>
+        </w:tc>
+      </w:tr>
+      <w:tr>
+        <w:tc>
+          <w:tcPr>
+            <w:tcW w:type="dxa" w:w="4873"/>
+          </w:tcPr>
+          <w:p>
+            <w:r>
+              <w:rPr>
+                <w:rFonts w:ascii="Calibri" w:hAnsi="Calibri" w:eastAsia="Calibri"/>
+                <w:b/>
+                <w:i w:val="0"/>
+                <w:color w:val="151A23"/>
+                <w:sz w:val="18"/>
+              </w:rPr>
+              <w:t>Steer</w:t>
+            </w:r>
+            <w:r>
+              <w:rPr>
+                <w:rFonts w:ascii="Calibri" w:hAnsi="Calibri" w:eastAsia="Calibri"/>
+                <w:b w:val="0"/>
+                <w:i w:val="0"/>
+                <w:color w:val="151A23"/>
+                <w:sz w:val="18"/>
+              </w:rPr>
+              <w:t xml:space="preserve"> (Pilot)</w:t>
+            </w:r>
+          </w:p>
+        </w:tc>
+        <w:tc>
+          <w:tcPr>
+            <w:tcW w:type="dxa" w:w="4873"/>
+          </w:tcPr>
+          <w:p>
+            <w:r>
+              <w:rPr>
+                <w:rFonts w:ascii="Calibri" w:hAnsi="Calibri" w:eastAsia="Calibri"/>
+                <w:b w:val="0"/>
+                <w:i w:val="0"/>
+                <w:color w:val="151A23"/>
+                <w:sz w:val="18"/>
+              </w:rPr>
+              <w:t xml:space="preserve">The screen of </w:t>
+            </w:r>
+            <w:r>
+              <w:rPr>
+                <w:rFonts w:ascii="Calibri" w:hAnsi="Calibri" w:eastAsia="Calibri"/>
+                <w:b/>
+                <w:i w:val="0"/>
+                <w:color w:val="151A23"/>
+                <w:sz w:val="18"/>
+              </w:rPr>
+              <w:t>one</w:t>
+            </w:r>
+            <w:r>
+              <w:rPr>
+                <w:rFonts w:ascii="Calibri" w:hAnsi="Calibri" w:eastAsia="Calibri"/>
+                <w:b w:val="0"/>
+                <w:i w:val="0"/>
+                <w:color w:val="151A23"/>
+                <w:sz w:val="18"/>
+              </w:rPr>
+              <w:t xml:space="preserve"> System where, if it is open, you can simulate then apply a change, then measure.</w:t>
+            </w:r>
+          </w:p>
+        </w:tc>
+      </w:tr>
+      <w:tr>
+        <w:tc>
+          <w:tcPr>
+            <w:tcW w:type="dxa" w:w="4873"/>
+          </w:tcPr>
+          <w:p>
+            <w:r>
+              <w:rPr>
+                <w:rFonts w:ascii="Calibri" w:hAnsi="Calibri" w:eastAsia="Calibri"/>
+                <w:b/>
+                <w:i w:val="0"/>
+                <w:color w:val="151A23"/>
+                <w:sz w:val="18"/>
+              </w:rPr>
+              <w:t>Value base</w:t>
+            </w:r>
+          </w:p>
+        </w:tc>
+        <w:tc>
+          <w:tcPr>
+            <w:tcW w:type="dxa" w:w="4873"/>
+          </w:tcPr>
+          <w:p>
+            <w:r>
+              <w:rPr>
+                <w:rFonts w:ascii="Calibri" w:hAnsi="Calibri" w:eastAsia="Calibri"/>
+                <w:b w:val="0"/>
+                <w:i w:val="0"/>
+                <w:color w:val="151A23"/>
+                <w:sz w:val="18"/>
+              </w:rPr>
+              <w:t xml:space="preserve">A signed convention (“this kind of result is worth X hours or Y €”). It is </w:t>
+            </w:r>
+            <w:r>
+              <w:rPr>
+                <w:rFonts w:ascii="Calibri" w:hAnsi="Calibri" w:eastAsia="Calibri"/>
+                <w:b/>
+                <w:i w:val="0"/>
+                <w:color w:val="151A23"/>
+                <w:sz w:val="18"/>
+              </w:rPr>
+              <w:t>declared</w:t>
+            </w:r>
+            <w:r>
+              <w:rPr>
+                <w:rFonts w:ascii="Calibri" w:hAnsi="Calibri" w:eastAsia="Calibri"/>
+                <w:b w:val="0"/>
+                <w:i w:val="0"/>
+                <w:color w:val="151A23"/>
+                <w:sz w:val="18"/>
+              </w:rPr>
+              <w:t>, not accounting.</w:t>
+            </w:r>
+          </w:p>
+        </w:tc>
+      </w:tr>
+      <w:tr>
+        <w:tc>
+          <w:tcPr>
+            <w:tcW w:type="dxa" w:w="4873"/>
+          </w:tcPr>
+          <w:p>
+            <w:r>
+              <w:rPr>
+                <w:rFonts w:ascii="Calibri" w:hAnsi="Calibri" w:eastAsia="Calibri"/>
+                <w:b/>
+                <w:i w:val="0"/>
+                <w:color w:val="151A23"/>
+                <w:sz w:val="18"/>
+              </w:rPr>
+              <w:t>Measured / declared / missing</w:t>
+            </w:r>
+          </w:p>
+        </w:tc>
+        <w:tc>
+          <w:tcPr>
+            <w:tcW w:type="dxa" w:w="4873"/>
+          </w:tcPr>
+          <w:p>
+            <w:r>
+              <w:rPr>
+                <w:rFonts w:ascii="Calibri" w:hAnsi="Calibri" w:eastAsia="Calibri"/>
+                <w:b w:val="0"/>
+                <w:i w:val="0"/>
+                <w:color w:val="151A23"/>
+                <w:sz w:val="18"/>
+              </w:rPr>
+              <w:t xml:space="preserve">Three qualities of a number. Missing </w:t>
+            </w:r>
+            <w:r>
+              <w:rPr>
+                <w:rFonts w:ascii="Calibri" w:hAnsi="Calibri" w:eastAsia="Calibri"/>
+                <w:b/>
+                <w:i w:val="0"/>
+                <w:color w:val="151A23"/>
+                <w:sz w:val="18"/>
+              </w:rPr>
+              <w:t>is not</w:t>
+            </w:r>
+            <w:r>
+              <w:rPr>
+                <w:rFonts w:ascii="Calibri" w:hAnsi="Calibri" w:eastAsia="Calibri"/>
+                <w:b w:val="0"/>
+                <w:i w:val="0"/>
+                <w:color w:val="151A23"/>
+                <w:sz w:val="18"/>
+              </w:rPr>
+              <w:t xml:space="preserve"> a zero.</w:t>
+            </w:r>
+          </w:p>
+        </w:tc>
+      </w:tr>
+    </w:tbl>
+    <w:p/>
+    <w:p>
+      <w:r>
+        <w:rPr>
+          <w:rFonts w:ascii="Calibri" w:hAnsi="Calibri" w:eastAsia="Calibri"/>
+          <w:b w:val="0"/>
+          <w:i w:val="0"/>
+          <w:color w:val="151A23"/>
+          <w:sz w:val="22"/>
+        </w:rPr>
+        <w:t xml:space="preserve">Words to avoid on screen: Desk, Board, workflow, pipeline, job, “HITL”. Say </w:t>
+      </w:r>
+      <w:r>
+        <w:rPr>
+          <w:rFonts w:ascii="Calibri" w:hAnsi="Calibri" w:eastAsia="Calibri"/>
+          <w:b/>
+          <w:i w:val="0"/>
+          <w:color w:val="151A23"/>
+          <w:sz w:val="22"/>
+        </w:rPr>
+        <w:t>Flow</w:t>
+      </w:r>
+      <w:r>
+        <w:rPr>
+          <w:rFonts w:ascii="Calibri" w:hAnsi="Calibri" w:eastAsia="Calibri"/>
+          <w:b w:val="0"/>
+          <w:i w:val="0"/>
+          <w:color w:val="151A23"/>
+          <w:sz w:val="22"/>
+        </w:rPr>
+        <w:t xml:space="preserve">, </w:t>
+      </w:r>
+      <w:r>
+        <w:rPr>
+          <w:rFonts w:ascii="Calibri" w:hAnsi="Calibri" w:eastAsia="Calibri"/>
+          <w:b/>
+          <w:i w:val="0"/>
+          <w:color w:val="151A23"/>
+          <w:sz w:val="22"/>
+        </w:rPr>
+        <w:t>Run</w:t>
+      </w:r>
+      <w:r>
+        <w:rPr>
+          <w:rFonts w:ascii="Calibri" w:hAnsi="Calibri" w:eastAsia="Calibri"/>
+          <w:b w:val="0"/>
+          <w:i w:val="0"/>
+          <w:color w:val="151A23"/>
+          <w:sz w:val="22"/>
+        </w:rPr>
+        <w:t xml:space="preserve">, </w:t>
+      </w:r>
+      <w:r>
+        <w:rPr>
+          <w:rFonts w:ascii="Calibri" w:hAnsi="Calibri" w:eastAsia="Calibri"/>
+          <w:b/>
+          <w:i w:val="0"/>
+          <w:color w:val="151A23"/>
+          <w:sz w:val="22"/>
+        </w:rPr>
+        <w:t>human approval</w:t>
+      </w:r>
+      <w:r>
+        <w:rPr>
+          <w:rFonts w:ascii="Calibri" w:hAnsi="Calibri" w:eastAsia="Calibri"/>
+          <w:b w:val="0"/>
+          <w:i w:val="0"/>
+          <w:color w:val="151A23"/>
           <w:sz w:val="22"/>
         </w:rPr>
         <w:t>.</w:t>
@@ -1022,7 +1718,7 @@
                 <w:color w:val="151A23"/>
                 <w:sz w:val="18"/>
               </w:rPr>
-              <w:t>Accept, reject, replay, promote a canonical answer, or governed enactment.</w:t>
+              <w:t>Accept, reject, replay, promote a reference answer, or apply a bounded change.</w:t>
             </w:r>
           </w:p>
         </w:tc>
@@ -1160,7 +1856,7 @@
                 <w:color w:val="0B2545"/>
                 <w:sz w:val="18"/>
               </w:rPr>
-              <w:t>Surface</w:t>
+              <w:t>Where</w:t>
             </w:r>
           </w:p>
         </w:tc>
@@ -1224,43 +1920,13 @@
           <w:p>
             <w:r>
               <w:rPr>
-                <w:rFonts w:ascii="Consolas" w:hAnsi="Consolas" w:eastAsia="Consolas"/>
-                <w:b w:val="0"/>
-                <w:i w:val="0"/>
-                <w:color w:val="0E6B6A"/>
-                <w:sz w:val="18"/>
-              </w:rPr>
-              <w:t>/hypervisor</w:t>
-            </w:r>
-            <w:r>
-              <w:rPr>
                 <w:rFonts w:ascii="Calibri" w:hAnsi="Calibri" w:eastAsia="Calibri"/>
                 <w:b w:val="0"/>
                 <w:i w:val="0"/>
                 <w:color w:val="151A23"/>
                 <w:sz w:val="18"/>
               </w:rPr>
-              <w:t xml:space="preserve"> (rail </w:t>
-            </w:r>
-            <w:r>
-              <w:rPr>
-                <w:rFonts w:ascii="Calibri" w:hAnsi="Calibri" w:eastAsia="Calibri"/>
-                <w:b/>
-                <w:i w:val="0"/>
-                <w:color w:val="151A23"/>
-                <w:sz w:val="18"/>
-              </w:rPr>
-              <w:t>Impact</w:t>
-            </w:r>
-            <w:r>
-              <w:rPr>
-                <w:rFonts w:ascii="Calibri" w:hAnsi="Calibri" w:eastAsia="Calibri"/>
-                <w:b w:val="0"/>
-                <w:i w:val="0"/>
-                <w:color w:val="151A23"/>
-                <w:sz w:val="18"/>
-              </w:rPr>
-              <w:t xml:space="preserve"> when the adoption experience is on)</w:t>
+              <w:t>Hypervisor / Impact</w:t>
             </w:r>
           </w:p>
         </w:tc>
@@ -1324,63 +1990,13 @@
           <w:p>
             <w:r>
               <w:rPr>
-                <w:rFonts w:ascii="Consolas" w:hAnsi="Consolas" w:eastAsia="Consolas"/>
-                <w:b w:val="0"/>
-                <w:i w:val="0"/>
-                <w:color w:val="0E6B6A"/>
-                <w:sz w:val="18"/>
-              </w:rPr>
-              <w:t>/work</w:t>
-            </w:r>
-            <w:r>
-              <w:rPr>
                 <w:rFonts w:ascii="Calibri" w:hAnsi="Calibri" w:eastAsia="Calibri"/>
                 <w:b w:val="0"/>
                 <w:i w:val="0"/>
                 <w:color w:val="151A23"/>
                 <w:sz w:val="18"/>
               </w:rPr>
-              <w:t xml:space="preserve">, </w:t>
-            </w:r>
-            <w:r>
-              <w:rPr>
-                <w:rFonts w:ascii="Consolas" w:hAnsi="Consolas" w:eastAsia="Consolas"/>
-                <w:b w:val="0"/>
-                <w:i w:val="0"/>
-                <w:color w:val="0E6B6A"/>
-                <w:sz w:val="18"/>
-              </w:rPr>
-              <w:t>/work/:slug</w:t>
-            </w:r>
-            <w:r>
-              <w:rPr>
-                <w:rFonts w:ascii="Calibri" w:hAnsi="Calibri" w:eastAsia="Calibri"/>
-                <w:b w:val="0"/>
-                <w:i w:val="0"/>
-                <w:color w:val="151A23"/>
-                <w:sz w:val="18"/>
-              </w:rPr>
-              <w:t xml:space="preserve">, Studio (e.g. </w:t>
-            </w:r>
-            <w:r>
-              <w:rPr>
-                <w:rFonts w:ascii="Consolas" w:hAnsi="Consolas" w:eastAsia="Consolas"/>
-                <w:b w:val="0"/>
-                <w:i w:val="0"/>
-                <w:color w:val="0E6B6A"/>
-                <w:sz w:val="18"/>
-              </w:rPr>
-              <w:t>/work/pr-to-po</w:t>
-            </w:r>
-            <w:r>
-              <w:rPr>
-                <w:rFonts w:ascii="Calibri" w:hAnsi="Calibri" w:eastAsia="Calibri"/>
-                <w:b w:val="0"/>
-                <w:i w:val="0"/>
-                <w:color w:val="151A23"/>
-                <w:sz w:val="18"/>
-              </w:rPr>
-              <w:t>)</w:t>
+              <w:t>Work, Studio (the published application)</w:t>
             </w:r>
           </w:p>
         </w:tc>
@@ -1397,7 +2013,27 @@
                 <w:color w:val="151A23"/>
                 <w:sz w:val="18"/>
               </w:rPr>
-              <w:t>A verifiable result, citations, a human gate if policy requires it.</w:t>
+              <w:t xml:space="preserve">A verifiable result, opened sources, a </w:t>
+            </w:r>
+            <w:r>
+              <w:rPr>
+                <w:rFonts w:ascii="Calibri" w:hAnsi="Calibri" w:eastAsia="Calibri"/>
+                <w:b/>
+                <w:i w:val="0"/>
+                <w:color w:val="151A23"/>
+                <w:sz w:val="18"/>
+              </w:rPr>
+              <w:t>human approval</w:t>
+            </w:r>
+            <w:r>
+              <w:rPr>
+                <w:rFonts w:ascii="Calibri" w:hAnsi="Calibri" w:eastAsia="Calibri"/>
+                <w:b w:val="0"/>
+                <w:i w:val="0"/>
+                <w:color w:val="151A23"/>
+                <w:sz w:val="18"/>
+              </w:rPr>
+              <w:t xml:space="preserve"> if the rule requires it.</w:t>
             </w:r>
           </w:p>
         </w:tc>
@@ -1444,63 +2080,13 @@
           <w:p>
             <w:r>
               <w:rPr>
-                <w:rFonts w:ascii="Consolas" w:hAnsi="Consolas" w:eastAsia="Consolas"/>
-                <w:b w:val="0"/>
-                <w:i w:val="0"/>
-                <w:color w:val="0E6B6A"/>
-                <w:sz w:val="18"/>
-              </w:rPr>
-              <w:t>/runs</w:t>
-            </w:r>
-            <w:r>
-              <w:rPr>
                 <w:rFonts w:ascii="Calibri" w:hAnsi="Calibri" w:eastAsia="Calibri"/>
                 <w:b w:val="0"/>
                 <w:i w:val="0"/>
                 <w:color w:val="151A23"/>
                 <w:sz w:val="18"/>
               </w:rPr>
-              <w:t xml:space="preserve">, </w:t>
-            </w:r>
-            <w:r>
-              <w:rPr>
-                <w:rFonts w:ascii="Consolas" w:hAnsi="Consolas" w:eastAsia="Consolas"/>
-                <w:b w:val="0"/>
-                <w:i w:val="0"/>
-                <w:color w:val="0E6B6A"/>
-                <w:sz w:val="18"/>
-              </w:rPr>
-              <w:t>/observability</w:t>
-            </w:r>
-            <w:r>
-              <w:rPr>
-                <w:rFonts w:ascii="Calibri" w:hAnsi="Calibri" w:eastAsia="Calibri"/>
-                <w:b w:val="0"/>
-                <w:i w:val="0"/>
-                <w:color w:val="151A23"/>
-                <w:sz w:val="18"/>
-              </w:rPr>
-              <w:t xml:space="preserve">, </w:t>
-            </w:r>
-            <w:r>
-              <w:rPr>
-                <w:rFonts w:ascii="Consolas" w:hAnsi="Consolas" w:eastAsia="Consolas"/>
-                <w:b w:val="0"/>
-                <w:i w:val="0"/>
-                <w:color w:val="0E6B6A"/>
-                <w:sz w:val="18"/>
-              </w:rPr>
-              <w:t>/steering/review-queue</w:t>
-            </w:r>
-            <w:r>
-              <w:rPr>
-                <w:rFonts w:ascii="Calibri" w:hAnsi="Calibri" w:eastAsia="Calibri"/>
-                <w:b w:val="0"/>
-                <w:i w:val="0"/>
-                <w:color w:val="151A23"/>
-                <w:sz w:val="18"/>
-              </w:rPr>
-              <w:t>, Diagnostics</w:t>
+              <w:t>Executions, review queue, Diagnostics</w:t>
             </w:r>
           </w:p>
         </w:tc>
@@ -1573,7 +2159,7 @@
                 <w:color w:val="151A23"/>
                 <w:sz w:val="18"/>
               </w:rPr>
-              <w:t>What is waiting for a signature, and where is it enacted?</w:t>
+              <w:t>What is waiting for a signature, and where does the change apply?</w:t>
             </w:r>
           </w:p>
         </w:tc>
@@ -1584,23 +2170,13 @@
           <w:p>
             <w:r>
               <w:rPr>
-                <w:rFonts w:ascii="Consolas" w:hAnsi="Consolas" w:eastAsia="Consolas"/>
-                <w:b w:val="0"/>
-                <w:i w:val="0"/>
-                <w:color w:val="0E6B6A"/>
-                <w:sz w:val="18"/>
-              </w:rPr>
-              <w:t>/hypervisor</w:t>
-            </w:r>
-            <w:r>
-              <w:rPr>
                 <w:rFonts w:ascii="Calibri" w:hAnsi="Calibri" w:eastAsia="Calibri"/>
                 <w:b w:val="0"/>
                 <w:i w:val="0"/>
                 <w:color w:val="151A23"/>
                 <w:sz w:val="18"/>
               </w:rPr>
-              <w:t xml:space="preserve"> feed (signal) · Work/Studio gates · </w:t>
+              <w:t xml:space="preserve">Hypervisor queue (opinion) · approval in the application · </w:t>
             </w:r>
             <w:r>
               <w:rPr>
@@ -1620,7 +2196,7 @@
                 <w:color w:val="151A23"/>
                 <w:sz w:val="18"/>
               </w:rPr>
-              <w:t xml:space="preserve"> value loop</w:t>
+              <w:t xml:space="preserve"> (apply)</w:t>
             </w:r>
           </w:p>
         </w:tc>
@@ -1637,27 +2213,7 @@
                 <w:color w:val="151A23"/>
                 <w:sz w:val="18"/>
               </w:rPr>
-              <w:t xml:space="preserve">A </w:t>
-            </w:r>
-            <w:r>
-              <w:rPr>
-                <w:rFonts w:ascii="Consolas" w:hAnsi="Consolas" w:eastAsia="Consolas"/>
-                <w:b w:val="0"/>
-                <w:i w:val="0"/>
-                <w:color w:val="0E6B6A"/>
-                <w:sz w:val="18"/>
-              </w:rPr>
-              <w:t>Decision</w:t>
-            </w:r>
-            <w:r>
-              <w:rPr>
-                <w:rFonts w:ascii="Calibri" w:hAnsi="Calibri" w:eastAsia="Calibri"/>
-                <w:b w:val="0"/>
-                <w:i w:val="0"/>
-                <w:color w:val="151A23"/>
-                <w:sz w:val="18"/>
-              </w:rPr>
-              <w:t xml:space="preserve"> state + an audit. The model cannot sign in their place.</w:t>
+              <w:t>A recorded opinion + a trace. The model cannot sign in their place.</w:t>
             </w:r>
           </w:p>
         </w:tc>
@@ -1667,13 +2223,65 @@
     <w:p>
       <w:r>
         <w:rPr>
+          <w:rFonts w:ascii="Calibri" w:hAnsi="Calibri" w:eastAsia="Calibri"/>
+          <w:b w:val="0"/>
+          <w:i w:val="0"/>
+          <w:color w:val="151A23"/>
+          <w:sz w:val="22"/>
+        </w:rPr>
+        <w:t xml:space="preserve">You move from Work to Cockpit by </w:t>
+      </w:r>
+      <w:r>
+        <w:rPr>
+          <w:rFonts w:ascii="Calibri" w:hAnsi="Calibri" w:eastAsia="Calibri"/>
+          <w:b/>
+          <w:i w:val="0"/>
+          <w:color w:val="151A23"/>
+          <w:sz w:val="22"/>
+        </w:rPr>
+        <w:t>rights</w:t>
+      </w:r>
+      <w:r>
+        <w:rPr>
+          <w:rFonts w:ascii="Calibri" w:hAnsi="Calibri" w:eastAsia="Calibri"/>
+          <w:b w:val="0"/>
+          <w:i w:val="0"/>
+          <w:color w:val="151A23"/>
+          <w:sz w:val="22"/>
+        </w:rPr>
+        <w:t>, not by a “mode” button. Identifiers, the log and deep links are shared.</w:t>
+      </w:r>
+    </w:p>
+    <w:p>
+      <w:r>
+        <w:rPr>
+          <w:rFonts w:ascii="Calibri" w:hAnsi="Calibri" w:eastAsia="Calibri"/>
+          <w:b w:val="0"/>
+          <w:i/>
+          <w:color w:val="151A23"/>
+          <w:sz w:val="22"/>
+        </w:rPr>
+        <w:t>Technical note:</w:t>
+      </w:r>
+      <w:r>
+        <w:rPr>
+          <w:rFonts w:ascii="Calibri" w:hAnsi="Calibri" w:eastAsia="Calibri"/>
+          <w:b w:val="0"/>
+          <w:i w:val="0"/>
+          <w:color w:val="151A23"/>
+          <w:sz w:val="22"/>
+        </w:rPr>
+        <w:t xml:space="preserve"> Hypervisor = </w:t>
+      </w:r>
+      <w:r>
+        <w:rPr>
           <w:rFonts w:ascii="Consolas" w:hAnsi="Consolas" w:eastAsia="Consolas"/>
           <w:b w:val="0"/>
           <w:i w:val="0"/>
           <w:color w:val="0E6B6A"/>
           <w:sz w:val="22"/>
         </w:rPr>
-        <w:t>Work ↔ Cockpit</w:t>
+        <w:t>/hypervisor</w:t>
       </w:r>
       <w:r>
         <w:rPr>
@@ -1683,7 +2291,7 @@
           <w:color w:val="151A23"/>
           <w:sz w:val="22"/>
         </w:rPr>
-        <w:t xml:space="preserve"> is an </w:t>
+        <w:t xml:space="preserve"> (the menu may say </w:t>
       </w:r>
       <w:r>
         <w:rPr>
@@ -1693,7 +2301,7 @@
           <w:color w:val="151A23"/>
           <w:sz w:val="22"/>
         </w:rPr>
-        <w:t>RBAC</w:t>
+        <w:t>Impact</w:t>
       </w:r>
       <w:r>
         <w:rPr>
@@ -1703,10 +2311,18 @@
           <w:color w:val="151A23"/>
           <w:sz w:val="22"/>
         </w:rPr>
-        <w:t xml:space="preserve"> link, not a theme toggle. Identifiers, audit and deep links are shared.</w:t>
-      </w:r>
-    </w:p>
-    <w:p>
+        <w:t xml:space="preserve"> when the welcome path is on). Work = </w:t>
+      </w:r>
+      <w:r>
+        <w:rPr>
+          <w:rFonts w:ascii="Consolas" w:hAnsi="Consolas" w:eastAsia="Consolas"/>
+          <w:b w:val="0"/>
+          <w:i w:val="0"/>
+          <w:color w:val="0E6B6A"/>
+          <w:sz w:val="22"/>
+        </w:rPr>
+        <w:t>/work</w:t>
+      </w:r>
       <w:r>
         <w:rPr>
           <w:rFonts w:ascii="Calibri" w:hAnsi="Calibri" w:eastAsia="Calibri"/>
@@ -1715,17 +2331,17 @@
           <w:color w:val="151A23"/>
           <w:sz w:val="22"/>
         </w:rPr>
-        <w:t xml:space="preserve">Words banned on screen and in a brief: </w:t>
-      </w:r>
-      <w:r>
-        <w:rPr>
-          <w:rFonts w:ascii="Calibri" w:hAnsi="Calibri" w:eastAsia="Calibri"/>
-          <w:b/>
+        <w:t xml:space="preserve">. Review queue = </w:t>
+      </w:r>
+      <w:r>
+        <w:rPr>
+          <w:rFonts w:ascii="Consolas" w:hAnsi="Consolas" w:eastAsia="Consolas"/>
+          <w:b w:val="0"/>
           <w:i w:val="0"/>
-          <w:color w:val="151A23"/>
-          <w:sz w:val="22"/>
-        </w:rPr>
-        <w:t>Desk</w:t>
+          <w:color w:val="0E6B6A"/>
+          <w:sz w:val="22"/>
+        </w:rPr>
+        <w:t>/steering/review-queue</w:t>
       </w:r>
       <w:r>
         <w:rPr>
@@ -1735,167 +2351,7 @@
           <w:color w:val="151A23"/>
           <w:sz w:val="22"/>
         </w:rPr>
-        <w:t xml:space="preserve">, </w:t>
-      </w:r>
-      <w:r>
-        <w:rPr>
-          <w:rFonts w:ascii="Calibri" w:hAnsi="Calibri" w:eastAsia="Calibri"/>
-          <w:b/>
-          <w:i w:val="0"/>
-          <w:color w:val="151A23"/>
-          <w:sz w:val="22"/>
-        </w:rPr>
-        <w:t>Board</w:t>
-      </w:r>
-      <w:r>
-        <w:rPr>
-          <w:rFonts w:ascii="Calibri" w:hAnsi="Calibri" w:eastAsia="Calibri"/>
-          <w:b w:val="0"/>
-          <w:i w:val="0"/>
-          <w:color w:val="151A23"/>
-          <w:sz w:val="22"/>
-        </w:rPr>
-        <w:t xml:space="preserve">, </w:t>
-      </w:r>
-      <w:r>
-        <w:rPr>
-          <w:rFonts w:ascii="Calibri" w:hAnsi="Calibri" w:eastAsia="Calibri"/>
-          <w:b/>
-          <w:i w:val="0"/>
-          <w:color w:val="151A23"/>
-          <w:sz w:val="22"/>
-        </w:rPr>
-        <w:t>workflow</w:t>
-      </w:r>
-      <w:r>
-        <w:rPr>
-          <w:rFonts w:ascii="Calibri" w:hAnsi="Calibri" w:eastAsia="Calibri"/>
-          <w:b w:val="0"/>
-          <w:i w:val="0"/>
-          <w:color w:val="151A23"/>
-          <w:sz w:val="22"/>
-        </w:rPr>
-        <w:t xml:space="preserve"> / </w:t>
-      </w:r>
-      <w:r>
-        <w:rPr>
-          <w:rFonts w:ascii="Calibri" w:hAnsi="Calibri" w:eastAsia="Calibri"/>
-          <w:b/>
-          <w:i w:val="0"/>
-          <w:color w:val="151A23"/>
-          <w:sz w:val="22"/>
-        </w:rPr>
-        <w:t>pipeline</w:t>
-      </w:r>
-      <w:r>
-        <w:rPr>
-          <w:rFonts w:ascii="Calibri" w:hAnsi="Calibri" w:eastAsia="Calibri"/>
-          <w:b w:val="0"/>
-          <w:i w:val="0"/>
-          <w:color w:val="151A23"/>
-          <w:sz w:val="22"/>
-        </w:rPr>
-        <w:t xml:space="preserve"> (say </w:t>
-      </w:r>
-      <w:r>
-        <w:rPr>
-          <w:rFonts w:ascii="Calibri" w:hAnsi="Calibri" w:eastAsia="Calibri"/>
-          <w:b/>
-          <w:i w:val="0"/>
-          <w:color w:val="151A23"/>
-          <w:sz w:val="22"/>
-        </w:rPr>
-        <w:t>Flow</w:t>
-      </w:r>
-      <w:r>
-        <w:rPr>
-          <w:rFonts w:ascii="Calibri" w:hAnsi="Calibri" w:eastAsia="Calibri"/>
-          <w:b w:val="0"/>
-          <w:i w:val="0"/>
-          <w:color w:val="151A23"/>
-          <w:sz w:val="22"/>
-        </w:rPr>
-        <w:t xml:space="preserve">), </w:t>
-      </w:r>
-      <w:r>
-        <w:rPr>
-          <w:rFonts w:ascii="Calibri" w:hAnsi="Calibri" w:eastAsia="Calibri"/>
-          <w:b/>
-          <w:i w:val="0"/>
-          <w:color w:val="151A23"/>
-          <w:sz w:val="22"/>
-        </w:rPr>
-        <w:t>job</w:t>
-      </w:r>
-      <w:r>
-        <w:rPr>
-          <w:rFonts w:ascii="Calibri" w:hAnsi="Calibri" w:eastAsia="Calibri"/>
-          <w:b w:val="0"/>
-          <w:i w:val="0"/>
-          <w:color w:val="151A23"/>
-          <w:sz w:val="22"/>
-        </w:rPr>
-        <w:t xml:space="preserve"> (say </w:t>
-      </w:r>
-      <w:r>
-        <w:rPr>
-          <w:rFonts w:ascii="Calibri" w:hAnsi="Calibri" w:eastAsia="Calibri"/>
-          <w:b/>
-          <w:i w:val="0"/>
-          <w:color w:val="151A23"/>
-          <w:sz w:val="22"/>
-        </w:rPr>
-        <w:t>Run</w:t>
-      </w:r>
-      <w:r>
-        <w:rPr>
-          <w:rFonts w:ascii="Calibri" w:hAnsi="Calibri" w:eastAsia="Calibri"/>
-          <w:b w:val="0"/>
-          <w:i w:val="0"/>
-          <w:color w:val="151A23"/>
-          <w:sz w:val="22"/>
-        </w:rPr>
-        <w:t xml:space="preserve">), </w:t>
-      </w:r>
-      <w:r>
-        <w:rPr>
-          <w:rFonts w:ascii="Calibri" w:hAnsi="Calibri" w:eastAsia="Calibri"/>
-          <w:b/>
-          <w:i w:val="0"/>
-          <w:color w:val="151A23"/>
-          <w:sz w:val="22"/>
-        </w:rPr>
-        <w:t>HITL</w:t>
-      </w:r>
-      <w:r>
-        <w:rPr>
-          <w:rFonts w:ascii="Calibri" w:hAnsi="Calibri" w:eastAsia="Calibri"/>
-          <w:b w:val="0"/>
-          <w:i w:val="0"/>
-          <w:color w:val="151A23"/>
-          <w:sz w:val="22"/>
-        </w:rPr>
-        <w:t xml:space="preserve"> as a label (say </w:t>
-      </w:r>
-      <w:r>
-        <w:rPr>
-          <w:rFonts w:ascii="Calibri" w:hAnsi="Calibri" w:eastAsia="Calibri"/>
-          <w:b/>
-          <w:i w:val="0"/>
-          <w:color w:val="151A23"/>
-          <w:sz w:val="22"/>
-        </w:rPr>
-        <w:t>human approval</w:t>
-      </w:r>
-      <w:r>
-        <w:rPr>
-          <w:rFonts w:ascii="Calibri" w:hAnsi="Calibri" w:eastAsia="Calibri"/>
-          <w:b w:val="0"/>
-          <w:i w:val="0"/>
-          <w:color w:val="151A23"/>
-          <w:sz w:val="22"/>
-        </w:rPr>
-        <w:t>).</w:t>
+        <w:t>.</w:t>
       </w:r>
     </w:p>
     <w:p>
@@ -2001,7 +2457,109 @@
           <w:color w:val="151A23"/>
           <w:sz w:val="22"/>
         </w:rPr>
-        <w:t xml:space="preserve">Single route: </w:t>
+        <w:t xml:space="preserve">Two possible readings of the same page: a </w:t>
+      </w:r>
+      <w:r>
+        <w:rPr>
+          <w:rFonts w:ascii="Calibri" w:hAnsi="Calibri" w:eastAsia="Calibri"/>
+          <w:b/>
+          <w:i w:val="0"/>
+          <w:color w:val="151A23"/>
+          <w:sz w:val="22"/>
+        </w:rPr>
+        <w:t>value balance sheet</w:t>
+      </w:r>
+      <w:r>
+        <w:rPr>
+          <w:rFonts w:ascii="Calibri" w:hAnsi="Calibri" w:eastAsia="Calibri"/>
+          <w:b w:val="0"/>
+          <w:i w:val="0"/>
+          <w:color w:val="151A23"/>
+          <w:sz w:val="22"/>
+        </w:rPr>
+        <w:t xml:space="preserve"> (older view) or a </w:t>
+      </w:r>
+      <w:r>
+        <w:rPr>
+          <w:rFonts w:ascii="Calibri" w:hAnsi="Calibri" w:eastAsia="Calibri"/>
+          <w:b/>
+          <w:i w:val="0"/>
+          <w:color w:val="151A23"/>
+          <w:sz w:val="22"/>
+        </w:rPr>
+        <w:t>ledger</w:t>
+      </w:r>
+      <w:r>
+        <w:rPr>
+          <w:rFonts w:ascii="Calibri" w:hAnsi="Calibri" w:eastAsia="Calibri"/>
+          <w:b w:val="0"/>
+          <w:i w:val="0"/>
+          <w:color w:val="151A23"/>
+          <w:sz w:val="22"/>
+        </w:rPr>
+        <w:t xml:space="preserve"> (newer view). The menu may say </w:t>
+      </w:r>
+      <w:r>
+        <w:rPr>
+          <w:rFonts w:ascii="Calibri" w:hAnsi="Calibri" w:eastAsia="Calibri"/>
+          <w:b/>
+          <w:i w:val="0"/>
+          <w:color w:val="151A23"/>
+          <w:sz w:val="22"/>
+        </w:rPr>
+        <w:t>Impact</w:t>
+      </w:r>
+      <w:r>
+        <w:rPr>
+          <w:rFonts w:ascii="Calibri" w:hAnsi="Calibri" w:eastAsia="Calibri"/>
+          <w:b w:val="0"/>
+          <w:i w:val="0"/>
+          <w:color w:val="151A23"/>
+          <w:sz w:val="22"/>
+        </w:rPr>
+        <w:t xml:space="preserve">. Renaming the tab </w:t>
+      </w:r>
+      <w:r>
+        <w:rPr>
+          <w:rFonts w:ascii="Calibri" w:hAnsi="Calibri" w:eastAsia="Calibri"/>
+          <w:b/>
+          <w:i w:val="0"/>
+          <w:color w:val="151A23"/>
+          <w:sz w:val="22"/>
+        </w:rPr>
+        <w:t>does not</w:t>
+      </w:r>
+      <w:r>
+        <w:rPr>
+          <w:rFonts w:ascii="Calibri" w:hAnsi="Calibri" w:eastAsia="Calibri"/>
+          <w:b w:val="0"/>
+          <w:i w:val="0"/>
+          <w:color w:val="151A23"/>
+          <w:sz w:val="22"/>
+        </w:rPr>
+        <w:t xml:space="preserve"> establish an economic result.</w:t>
+      </w:r>
+    </w:p>
+    <w:p>
+      <w:r>
+        <w:rPr>
+          <w:rFonts w:ascii="Calibri" w:hAnsi="Calibri" w:eastAsia="Calibri"/>
+          <w:b w:val="0"/>
+          <w:i/>
+          <w:color w:val="151A23"/>
+          <w:sz w:val="22"/>
+        </w:rPr>
+        <w:t>Technical note:</w:t>
+      </w:r>
+      <w:r>
+        <w:rPr>
+          <w:rFonts w:ascii="Calibri" w:hAnsi="Calibri" w:eastAsia="Calibri"/>
+          <w:b w:val="0"/>
+          <w:i w:val="0"/>
+          <w:color w:val="151A23"/>
+          <w:sz w:val="22"/>
+        </w:rPr>
+        <w:t xml:space="preserve"> single route </w:t>
       </w:r>
       <w:r>
         <w:rPr>
@@ -2021,7 +2579,7 @@
           <w:color w:val="151A23"/>
           <w:sz w:val="22"/>
         </w:rPr>
-        <w:t xml:space="preserve">. The component (v1 or v2) depends on the workspace flag </w:t>
+        <w:t xml:space="preserve">. The newer view turns on with the workspace switch </w:t>
       </w:r>
       <w:r>
         <w:rPr>
@@ -2031,7 +2589,7 @@
           <w:color w:val="0E6B6A"/>
           <w:sz w:val="22"/>
         </w:rPr>
-        <w:t>settings.features.hypervisor_v2</w:t>
+        <w:t>hypervisor_v2</w:t>
       </w:r>
       <w:r>
         <w:rPr>
@@ -2041,99 +2599,7 @@
           <w:color w:val="151A23"/>
           <w:sz w:val="22"/>
         </w:rPr>
-        <w:t xml:space="preserve">. Absent or </w:t>
-      </w:r>
-      <w:r>
-        <w:rPr>
-          <w:rFonts w:ascii="Consolas" w:hAnsi="Consolas" w:eastAsia="Consolas"/>
-          <w:b w:val="0"/>
-          <w:i w:val="0"/>
-          <w:color w:val="0E6B6A"/>
-          <w:sz w:val="22"/>
-        </w:rPr>
-        <w:t>false</w:t>
-      </w:r>
-      <w:r>
-        <w:rPr>
-          <w:rFonts w:ascii="Calibri" w:hAnsi="Calibri" w:eastAsia="Calibri"/>
-          <w:b w:val="0"/>
-          <w:i w:val="0"/>
-          <w:color w:val="151A23"/>
-          <w:sz w:val="22"/>
-        </w:rPr>
-        <w:t xml:space="preserve"> → v1.</w:t>
-      </w:r>
-    </w:p>
-    <w:p>
-      <w:r>
-        <w:rPr>
-          <w:rFonts w:ascii="Calibri" w:hAnsi="Calibri" w:eastAsia="Calibri"/>
-          <w:b w:val="0"/>
-          <w:i w:val="0"/>
-          <w:color w:val="151A23"/>
-          <w:sz w:val="22"/>
-        </w:rPr>
-        <w:t xml:space="preserve">With the adoption experience, the Cockpit rail relabels this zone </w:t>
-      </w:r>
-      <w:r>
-        <w:rPr>
-          <w:rFonts w:ascii="Calibri" w:hAnsi="Calibri" w:eastAsia="Calibri"/>
-          <w:b/>
-          <w:i w:val="0"/>
-          <w:color w:val="151A23"/>
-          <w:sz w:val="22"/>
-        </w:rPr>
-        <w:t>Impact</w:t>
-      </w:r>
-      <w:r>
-        <w:rPr>
-          <w:rFonts w:ascii="Calibri" w:hAnsi="Calibri" w:eastAsia="Calibri"/>
-          <w:b w:val="0"/>
-          <w:i w:val="0"/>
-          <w:color w:val="151A23"/>
-          <w:sz w:val="22"/>
-        </w:rPr>
-        <w:t xml:space="preserve">. The navigation id stays </w:t>
-      </w:r>
-      <w:r>
-        <w:rPr>
-          <w:rFonts w:ascii="Consolas" w:hAnsi="Consolas" w:eastAsia="Consolas"/>
-          <w:b w:val="0"/>
-          <w:i w:val="0"/>
-          <w:color w:val="0E6B6A"/>
-          <w:sz w:val="22"/>
-        </w:rPr>
-        <w:t>hypervisor</w:t>
-      </w:r>
-      <w:r>
-        <w:rPr>
-          <w:rFonts w:ascii="Calibri" w:hAnsi="Calibri" w:eastAsia="Calibri"/>
-          <w:b w:val="0"/>
-          <w:i w:val="0"/>
-          <w:color w:val="151A23"/>
-          <w:sz w:val="22"/>
-        </w:rPr>
-        <w:t xml:space="preserve">. Renaming the tab </w:t>
-      </w:r>
-      <w:r>
-        <w:rPr>
-          <w:rFonts w:ascii="Calibri" w:hAnsi="Calibri" w:eastAsia="Calibri"/>
-          <w:b/>
-          <w:i w:val="0"/>
-          <w:color w:val="151A23"/>
-          <w:sz w:val="22"/>
-        </w:rPr>
-        <w:t>does not</w:t>
-      </w:r>
-      <w:r>
-        <w:rPr>
-          <w:rFonts w:ascii="Calibri" w:hAnsi="Calibri" w:eastAsia="Calibri"/>
-          <w:b w:val="0"/>
-          <w:i w:val="0"/>
-          <w:color w:val="151A23"/>
-          <w:sz w:val="22"/>
-        </w:rPr>
-        <w:t xml:space="preserve"> establish an economic outcome.</w:t>
+        <w:t>.</w:t>
       </w:r>
     </w:p>
     <w:p>
@@ -2148,7 +2614,7 @@
           <w:color w:val="0B2545"/>
           <w:sz w:val="26"/>
         </w:rPr>
-        <w:t>3.2 Two readings, one Decision object</w:t>
+        <w:t>3.2 Two readings, one opinion to sign</w:t>
       </w:r>
     </w:p>
     <w:tbl>
@@ -2182,7 +2648,7 @@
                 <w:color w:val="0B2545"/>
                 <w:sz w:val="18"/>
               </w:rPr>
-              <w:t>v1 — Value balance sheet</w:t>
+              <w:t>Older view — Value balance sheet</w:t>
             </w:r>
           </w:p>
         </w:tc>
@@ -2199,37 +2665,7 @@
                 <w:color w:val="0B2545"/>
                 <w:sz w:val="18"/>
               </w:rPr>
-              <w:t>v2 — Ledger</w:t>
-            </w:r>
-            <w:r>
-              <w:rPr>
-                <w:rFonts w:ascii="Calibri" w:hAnsi="Calibri" w:eastAsia="Calibri"/>
-                <w:b/>
-                <w:i w:val="0"/>
-                <w:color w:val="0B2545"/>
-                <w:sz w:val="18"/>
-              </w:rPr>
-              <w:t xml:space="preserve"> (flag </w:t>
-            </w:r>
-            <w:r>
-              <w:rPr>
-                <w:rFonts w:ascii="Consolas" w:hAnsi="Consolas" w:eastAsia="Consolas"/>
-                <w:b/>
-                <w:i w:val="0"/>
-                <w:color w:val="0B2545"/>
-                <w:sz w:val="18"/>
-              </w:rPr>
-              <w:t>hypervisor_v2</w:t>
-            </w:r>
-            <w:r>
-              <w:rPr>
-                <w:rFonts w:ascii="Calibri" w:hAnsi="Calibri" w:eastAsia="Calibri"/>
-                <w:b/>
-                <w:i w:val="0"/>
-                <w:color w:val="0B2545"/>
-                <w:sz w:val="18"/>
-              </w:rPr>
-              <w:t>)</w:t>
+              <w:t>Newer view — Ledger</w:t>
             </w:r>
           </w:p>
         </w:tc>
@@ -2248,7 +2684,7 @@
                 <w:color w:val="151A23"/>
                 <w:sz w:val="18"/>
               </w:rPr>
-              <w:t>UI promise</w:t>
+              <w:t>On-screen promise</w:t>
             </w:r>
           </w:p>
         </w:tc>
@@ -2265,7 +2701,7 @@
                 <w:color w:val="151A23"/>
                 <w:sz w:val="18"/>
               </w:rPr>
-              <w:t>“Net value generated” — cost, estimated value, ROI, signals, SCAN recommendations</w:t>
+              <w:t>“Net value generated” — cost, estimated value, ROI, signals, recommendations</w:t>
             </w:r>
           </w:p>
         </w:tc>
@@ -2301,7 +2737,7 @@
                 <w:color w:val="151A23"/>
                 <w:sz w:val="18"/>
               </w:rPr>
-              <w:t>Strata</w:t>
+              <w:t>How you read</w:t>
             </w:r>
           </w:p>
         </w:tc>
@@ -2318,7 +2754,7 @@
                 <w:color w:val="151A23"/>
                 <w:sz w:val="18"/>
               </w:rPr>
-              <w:t>Hero + KPI + capabilities + signals + recos + decisions</w:t>
+              <w:t>One page of figures + signals + decisions</w:t>
             </w:r>
           </w:p>
         </w:tc>
@@ -2354,7 +2790,7 @@
                 <w:color w:val="151A23"/>
                 <w:sz w:val="18"/>
               </w:rPr>
-              <w:t>Views</w:t>
+              <w:t>Windows</w:t>
             </w:r>
           </w:p>
         </w:tc>
@@ -2371,7 +2807,7 @@
                 <w:color w:val="151A23"/>
                 <w:sz w:val="18"/>
               </w:rPr>
-              <w:t>One page, WTD/MTD/QTD/30d/90d</w:t>
+              <w:t>One page, period of choice (week / month / 30d / 90d)</w:t>
             </w:r>
           </w:p>
         </w:tc>
@@ -2388,7 +2824,7 @@
                 <w:color w:val="151A23"/>
                 <w:sz w:val="18"/>
               </w:rPr>
-              <w:t>Direction (hours, 90d) · Operations (runs, 30d) · Compliance (runs, 90d)</w:t>
+              <w:t>Direction (hours, 90d) · Operations (executions, 30d) · Compliance (executions, 90d)</w:t>
             </w:r>
           </w:p>
         </w:tc>
@@ -2407,7 +2843,7 @@
                 <w:color w:val="151A23"/>
                 <w:sz w:val="18"/>
               </w:rPr>
-              <w:t>Portfolio value loop</w:t>
+              <w:t>Value-loop summary</w:t>
             </w:r>
           </w:p>
         </w:tc>
@@ -2424,27 +2860,7 @@
                 <w:color w:val="151A23"/>
                 <w:sz w:val="18"/>
               </w:rPr>
-              <w:t>Yes — read-only aggregate (</w:t>
-            </w:r>
-            <w:r>
-              <w:rPr>
-                <w:rFonts w:ascii="Consolas" w:hAnsi="Consolas" w:eastAsia="Consolas"/>
-                <w:b w:val="0"/>
-                <w:i w:val="0"/>
-                <w:color w:val="0E6B6A"/>
-                <w:sz w:val="18"/>
-              </w:rPr>
-              <w:t>GET /hypervisor/value-loop</w:t>
-            </w:r>
-            <w:r>
-              <w:rPr>
-                <w:rFonts w:ascii="Calibri" w:hAnsi="Calibri" w:eastAsia="Calibri"/>
-                <w:b w:val="0"/>
-                <w:i w:val="0"/>
-                <w:color w:val="151A23"/>
-                <w:sz w:val="18"/>
-              </w:rPr>
-              <w:t>)</w:t>
+              <w:t>Yes — a read-only aggregate</w:t>
             </w:r>
           </w:p>
         </w:tc>
@@ -2461,7 +2877,7 @@
                 <w:color w:val="151A23"/>
                 <w:sz w:val="18"/>
               </w:rPr>
-              <w:t>No — v2 is an instrumented ledger, not the same dashboard</w:t>
+              <w:t>No — the ledger is not the same dashboard</w:t>
             </w:r>
           </w:p>
         </w:tc>
@@ -2530,7 +2946,7 @@
           <w:color w:val="151A23"/>
           <w:sz w:val="22"/>
         </w:rPr>
-        <w:t xml:space="preserve">Both versions </w:t>
+        <w:t xml:space="preserve">Both views </w:t>
       </w:r>
       <w:r>
         <w:rPr>
@@ -2540,7 +2956,7 @@
           <w:color w:val="151A23"/>
           <w:sz w:val="22"/>
         </w:rPr>
-        <w:t>accept and reject</w:t>
+        <w:t>record an opinion</w:t>
       </w:r>
       <w:r>
         <w:rPr>
@@ -2550,7 +2966,71 @@
           <w:color w:val="151A23"/>
           <w:sz w:val="22"/>
         </w:rPr>
-        <w:t xml:space="preserve"> a proposed </w:t>
+        <w:t xml:space="preserve"> (accept / reject). Neither </w:t>
+      </w:r>
+      <w:r>
+        <w:rPr>
+          <w:rFonts w:ascii="Calibri" w:hAnsi="Calibri" w:eastAsia="Calibri"/>
+          <w:b/>
+          <w:i w:val="0"/>
+          <w:color w:val="151A23"/>
+          <w:sz w:val="22"/>
+        </w:rPr>
+        <w:t>applies</w:t>
+      </w:r>
+      <w:r>
+        <w:rPr>
+          <w:rFonts w:ascii="Calibri" w:hAnsi="Calibri" w:eastAsia="Calibri"/>
+          <w:b w:val="0"/>
+          <w:i w:val="0"/>
+          <w:color w:val="151A23"/>
+          <w:sz w:val="22"/>
+        </w:rPr>
+        <w:t xml:space="preserve"> a rule change via “Apply”: that is refused on purpose, and the screen points to one System’s pilot screen. That is not a demo bug.</w:t>
+      </w:r>
+    </w:p>
+    <w:p>
+      <w:r>
+        <w:rPr>
+          <w:rFonts w:ascii="Calibri" w:hAnsi="Calibri" w:eastAsia="Calibri"/>
+          <w:b w:val="0"/>
+          <w:i w:val="0"/>
+          <w:color w:val="151A23"/>
+          <w:sz w:val="22"/>
+        </w:rPr>
+        <w:t xml:space="preserve">Line to say: </w:t>
+      </w:r>
+      <w:r>
+        <w:rPr>
+          <w:rFonts w:ascii="Calibri" w:hAnsi="Calibri" w:eastAsia="Calibri"/>
+          <w:b w:val="0"/>
+          <w:i/>
+          <w:color w:val="151A23"/>
+          <w:sz w:val="22"/>
+        </w:rPr>
+        <w:t>“Validating here records an opinion. Changing a System goes through its pilot screen: Simulate → Approve → Apply → Measure.”</w:t>
+      </w:r>
+    </w:p>
+    <w:p>
+      <w:r>
+        <w:rPr>
+          <w:rFonts w:ascii="Calibri" w:hAnsi="Calibri" w:eastAsia="Calibri"/>
+          <w:b w:val="0"/>
+          <w:i/>
+          <w:color w:val="151A23"/>
+          <w:sz w:val="22"/>
+        </w:rPr>
+        <w:t>Technical note:</w:t>
+      </w:r>
+      <w:r>
+        <w:rPr>
+          <w:rFonts w:ascii="Calibri" w:hAnsi="Calibri" w:eastAsia="Calibri"/>
+          <w:b w:val="0"/>
+          <w:i w:val="0"/>
+          <w:color w:val="151A23"/>
+          <w:sz w:val="22"/>
+        </w:rPr>
+        <w:t xml:space="preserve"> the old apply path returns an explicit refusal (</w:t>
       </w:r>
       <w:r>
         <w:rPr>
@@ -2560,7 +3040,7 @@
           <w:color w:val="0E6B6A"/>
           <w:sz w:val="22"/>
         </w:rPr>
-        <w:t>Decision</w:t>
+        <w:t>LEGACY_DECISION_ACTUATOR_DISABLED</w:t>
       </w:r>
       <w:r>
         <w:rPr>
@@ -2570,69 +3050,7 @@
           <w:color w:val="151A23"/>
           <w:sz w:val="22"/>
         </w:rPr>
-        <w:t xml:space="preserve">. Neither </w:t>
-      </w:r>
-      <w:r>
-        <w:rPr>
-          <w:rFonts w:ascii="Calibri" w:hAnsi="Calibri" w:eastAsia="Calibri"/>
-          <w:b/>
-          <w:i w:val="0"/>
-          <w:color w:val="151A23"/>
-          <w:sz w:val="22"/>
-        </w:rPr>
-        <w:t>enacts</w:t>
-      </w:r>
-      <w:r>
-        <w:rPr>
-          <w:rFonts w:ascii="Calibri" w:hAnsi="Calibri" w:eastAsia="Calibri"/>
-          <w:b w:val="0"/>
-          <w:i w:val="0"/>
-          <w:color w:val="151A23"/>
-          <w:sz w:val="22"/>
-        </w:rPr>
-        <w:t xml:space="preserve"> a policy change via “Apply”: the API returns </w:t>
-      </w:r>
-      <w:r>
-        <w:rPr>
-          <w:rFonts w:ascii="Consolas" w:hAnsi="Consolas" w:eastAsia="Consolas"/>
-          <w:b w:val="0"/>
-          <w:i w:val="0"/>
-          <w:color w:val="0E6B6A"/>
-          <w:sz w:val="22"/>
-        </w:rPr>
-        <w:t>LEGACY_DECISION_ACTUATOR_DISABLED</w:t>
-      </w:r>
-      <w:r>
-        <w:rPr>
-          <w:rFonts w:ascii="Calibri" w:hAnsi="Calibri" w:eastAsia="Calibri"/>
-          <w:b w:val="0"/>
-          <w:i w:val="0"/>
-          <w:color w:val="151A23"/>
-          <w:sz w:val="22"/>
-        </w:rPr>
-        <w:t xml:space="preserve"> and points to a System value loop. That is intentional, not a demo bug.</w:t>
-      </w:r>
-    </w:p>
-    <w:p>
-      <w:r>
-        <w:rPr>
-          <w:rFonts w:ascii="Calibri" w:hAnsi="Calibri" w:eastAsia="Calibri"/>
-          <w:b w:val="0"/>
-          <w:i w:val="0"/>
-          <w:color w:val="151A23"/>
-          <w:sz w:val="22"/>
-        </w:rPr>
-        <w:t xml:space="preserve">Line to say: </w:t>
-      </w:r>
-      <w:r>
-        <w:rPr>
-          <w:rFonts w:ascii="Calibri" w:hAnsi="Calibri" w:eastAsia="Calibri"/>
-          <w:b w:val="0"/>
-          <w:i/>
-          <w:color w:val="151A23"/>
-          <w:sz w:val="22"/>
-        </w:rPr>
-        <w:t>“Validating here records a decision signal. Changing a System’s behaviour goes through Steer: Simulate → Approve → Act → Measure.”</w:t>
+        <w:t>).</w:t>
       </w:r>
     </w:p>
     <w:p>
@@ -3034,13 +3452,13 @@
     <w:p>
       <w:r>
         <w:rPr>
-          <w:rFonts w:ascii="Consolas" w:hAnsi="Consolas" w:eastAsia="Consolas"/>
-          <w:b w:val="0"/>
+          <w:rFonts w:ascii="Calibri" w:hAnsi="Calibri" w:eastAsia="Calibri"/>
+          <w:b/>
           <w:i w:val="0"/>
-          <w:color w:val="0E6B6A"/>
-          <w:sz w:val="22"/>
-        </w:rPr>
-        <w:t>/hypervisor/mission-room/*</w:t>
+          <w:color w:val="151A23"/>
+          <w:sz w:val="22"/>
+        </w:rPr>
+        <w:t>Mission Room</w:t>
       </w:r>
       <w:r>
         <w:rPr>
@@ -3070,7 +3488,7 @@
           <w:color w:val="151A23"/>
           <w:sz w:val="22"/>
         </w:rPr>
-        <w:t xml:space="preserve"> (Sentinel-CI, Octocity, or the generic provider). Ministerial briefing, map, watch, cabinet arbitration. Same URL prefix, </w:t>
+        <w:t xml:space="preserve"> (government / city-style briefing). Same address family as the Hypervisor, </w:t>
       </w:r>
       <w:r>
         <w:rPr>
@@ -3144,15 +3562,15 @@
           <w:color w:val="0E6B6A"/>
           <w:sz w:val="18"/>
         </w:rPr>
-        <w:t>Portfolio             System                    Application</w:t>
+        <w:t>Portfolio                    One System                   The application</w:t>
         <w:br/>
-        <w:t>/hypervisor           /systems/:id?lens=steer   /work/:slug  (Studio)</w:t>
+        <w:t>Hypervisor / Impact          Pilot screen (Steer)         Studio</w:t>
         <w:br/>
-        <w:t>accept / reject       Simulate → Approve        human gate</w:t>
+        <w:t>accept / reject              Simulate → Approve           human approval</w:t>
         <w:br/>
-        <w:t>= signal              → Act → Measure           = required</w:t>
+        <w:t>= an opinion                 → Apply → Measure            = required</w:t>
         <w:br/>
-        <w:t xml:space="preserve">                      = bounded enactment       approval</w:t>
+        <w:t xml:space="preserve">                             = bounded change</w:t>
       </w:r>
     </w:p>
     <w:p>
@@ -3167,10 +3585,102 @@
           <w:color w:val="0B2545"/>
           <w:sz w:val="26"/>
         </w:rPr>
-        <w:t>4.1 Portfolio signal</w:t>
+        <w:t>4.1 An opinion on the portfolio</w:t>
       </w:r>
     </w:p>
     <w:p>
+      <w:r>
+        <w:rPr>
+          <w:rFonts w:ascii="Calibri" w:hAnsi="Calibri" w:eastAsia="Calibri"/>
+          <w:b w:val="0"/>
+          <w:i w:val="0"/>
+          <w:color w:val="151A23"/>
+          <w:sz w:val="22"/>
+        </w:rPr>
+        <w:t xml:space="preserve">Accepting or rejecting in the Hypervisor moves the proposal to </w:t>
+      </w:r>
+      <w:r>
+        <w:rPr>
+          <w:rFonts w:ascii="Calibri" w:hAnsi="Calibri" w:eastAsia="Calibri"/>
+          <w:b w:val="0"/>
+          <w:i/>
+          <w:color w:val="151A23"/>
+          <w:sz w:val="22"/>
+        </w:rPr>
+        <w:t>accepted</w:t>
+      </w:r>
+      <w:r>
+        <w:rPr>
+          <w:rFonts w:ascii="Calibri" w:hAnsi="Calibri" w:eastAsia="Calibri"/>
+          <w:b w:val="0"/>
+          <w:i w:val="0"/>
+          <w:color w:val="151A23"/>
+          <w:sz w:val="22"/>
+        </w:rPr>
+        <w:t xml:space="preserve"> or </w:t>
+      </w:r>
+      <w:r>
+        <w:rPr>
+          <w:rFonts w:ascii="Calibri" w:hAnsi="Calibri" w:eastAsia="Calibri"/>
+          <w:b w:val="0"/>
+          <w:i/>
+          <w:color w:val="151A23"/>
+          <w:sz w:val="22"/>
+        </w:rPr>
+        <w:t>rejected</w:t>
+      </w:r>
+      <w:r>
+        <w:rPr>
+          <w:rFonts w:ascii="Calibri" w:hAnsi="Calibri" w:eastAsia="Calibri"/>
+          <w:b w:val="0"/>
+          <w:i w:val="0"/>
+          <w:color w:val="151A23"/>
+          <w:sz w:val="22"/>
+        </w:rPr>
+        <w:t xml:space="preserve">. That sometimes feeds a quality review. A </w:t>
+      </w:r>
+      <w:r>
+        <w:rPr>
+          <w:rFonts w:ascii="Calibri" w:hAnsi="Calibri" w:eastAsia="Calibri"/>
+          <w:b/>
+          <w:i w:val="0"/>
+          <w:color w:val="151A23"/>
+          <w:sz w:val="22"/>
+        </w:rPr>
+        <w:t>rule-change</w:t>
+      </w:r>
+      <w:r>
+        <w:rPr>
+          <w:rFonts w:ascii="Calibri" w:hAnsi="Calibri" w:eastAsia="Calibri"/>
+          <w:b w:val="0"/>
+          <w:i w:val="0"/>
+          <w:color w:val="151A23"/>
+          <w:sz w:val="22"/>
+        </w:rPr>
+        <w:t xml:space="preserve"> scenario refuses this path: it must go through the System’s pilot screen.</w:t>
+      </w:r>
+    </w:p>
+    <w:p>
+      <w:r>
+        <w:rPr>
+          <w:rFonts w:ascii="Calibri" w:hAnsi="Calibri" w:eastAsia="Calibri"/>
+          <w:b w:val="0"/>
+          <w:i/>
+          <w:color w:val="151A23"/>
+          <w:sz w:val="22"/>
+        </w:rPr>
+        <w:t>Technical note:</w:t>
+      </w:r>
+      <w:r>
+        <w:rPr>
+          <w:rFonts w:ascii="Calibri" w:hAnsi="Calibri" w:eastAsia="Calibri"/>
+          <w:b w:val="0"/>
+          <w:i w:val="0"/>
+          <w:color w:val="151A23"/>
+          <w:sz w:val="22"/>
+        </w:rPr>
+        <w:t xml:space="preserve"> </w:t>
+      </w:r>
       <w:r>
         <w:rPr>
           <w:rFonts w:ascii="Consolas" w:hAnsi="Consolas" w:eastAsia="Consolas"/>
@@ -3189,87 +3699,7 @@
           <w:color w:val="151A23"/>
           <w:sz w:val="22"/>
         </w:rPr>
-        <w:t xml:space="preserve"> moves </w:t>
-      </w:r>
-      <w:r>
-        <w:rPr>
-          <w:rFonts w:ascii="Consolas" w:hAnsi="Consolas" w:eastAsia="Consolas"/>
-          <w:b w:val="0"/>
-          <w:i w:val="0"/>
-          <w:color w:val="0E6B6A"/>
-          <w:sz w:val="22"/>
-        </w:rPr>
-        <w:t>proposed → accepted | rejected</w:t>
-      </w:r>
-      <w:r>
-        <w:rPr>
-          <w:rFonts w:ascii="Calibri" w:hAnsi="Calibri" w:eastAsia="Calibri"/>
-          <w:b w:val="0"/>
-          <w:i w:val="0"/>
-          <w:color w:val="151A23"/>
-          <w:sz w:val="22"/>
-        </w:rPr>
-        <w:t xml:space="preserve">. A </w:t>
-      </w:r>
-      <w:r>
-        <w:rPr>
-          <w:rFonts w:ascii="Consolas" w:hAnsi="Consolas" w:eastAsia="Consolas"/>
-          <w:b w:val="0"/>
-          <w:i w:val="0"/>
-          <w:color w:val="0E6B6A"/>
-          <w:sz w:val="22"/>
-        </w:rPr>
-        <w:t>kind=review_required</w:t>
-      </w:r>
-      <w:r>
-        <w:rPr>
-          <w:rFonts w:ascii="Calibri" w:hAnsi="Calibri" w:eastAsia="Calibri"/>
-          <w:b w:val="0"/>
-          <w:i w:val="0"/>
-          <w:color w:val="151A23"/>
-          <w:sz w:val="22"/>
-        </w:rPr>
-        <w:t xml:space="preserve"> may feed evaluation feedback. A </w:t>
-      </w:r>
-      <w:r>
-        <w:rPr>
-          <w:rFonts w:ascii="Consolas" w:hAnsi="Consolas" w:eastAsia="Consolas"/>
-          <w:b w:val="0"/>
-          <w:i w:val="0"/>
-          <w:color w:val="0E6B6A"/>
-          <w:sz w:val="22"/>
-        </w:rPr>
-        <w:t>scenario_id</w:t>
-      </w:r>
-      <w:r>
-        <w:rPr>
-          <w:rFonts w:ascii="Calibri" w:hAnsi="Calibri" w:eastAsia="Calibri"/>
-          <w:b w:val="0"/>
-          <w:i w:val="0"/>
-          <w:color w:val="151A23"/>
-          <w:sz w:val="22"/>
-        </w:rPr>
-        <w:t xml:space="preserve"> (value loop) </w:t>
-      </w:r>
-      <w:r>
-        <w:rPr>
-          <w:rFonts w:ascii="Calibri" w:hAnsi="Calibri" w:eastAsia="Calibri"/>
-          <w:b/>
-          <w:i w:val="0"/>
-          <w:color w:val="151A23"/>
-          <w:sz w:val="22"/>
-        </w:rPr>
-        <w:t>refuses</w:t>
-      </w:r>
-      <w:r>
-        <w:rPr>
-          <w:rFonts w:ascii="Calibri" w:hAnsi="Calibri" w:eastAsia="Calibri"/>
-          <w:b w:val="0"/>
-          <w:i w:val="0"/>
-          <w:color w:val="151A23"/>
-          <w:sz w:val="22"/>
-        </w:rPr>
-        <w:t xml:space="preserve"> this path: it must go through the value orchestrator.</w:t>
+        <w:t>.</w:t>
       </w:r>
     </w:p>
     <w:p>
@@ -3284,7 +3714,7 @@
           <w:color w:val="0B2545"/>
           <w:sz w:val="26"/>
         </w:rPr>
-        <w:t>4.2 Enactment — value loop (Lot 8)</w:t>
+        <w:t>4.2 Apply a change — value loop</w:t>
       </w:r>
     </w:p>
     <w:p>
@@ -3296,17 +3726,17 @@
           <w:color w:val="151A23"/>
           <w:sz w:val="22"/>
         </w:rPr>
-        <w:t xml:space="preserve">Contract: </w:t>
-      </w:r>
-      <w:r>
-        <w:rPr>
-          <w:rFonts w:ascii="Consolas" w:hAnsi="Consolas" w:eastAsia="Consolas"/>
-          <w:b w:val="0"/>
+        <w:t xml:space="preserve">Visible contract: </w:t>
+      </w:r>
+      <w:r>
+        <w:rPr>
+          <w:rFonts w:ascii="Calibri" w:hAnsi="Calibri" w:eastAsia="Calibri"/>
+          <w:b/>
           <w:i w:val="0"/>
-          <w:color w:val="0E6B6A"/>
-          <w:sz w:val="22"/>
-        </w:rPr>
-        <w:t>Outcome → Decision → Simulate → Approve → Act → Measure</w:t>
+          <w:color w:val="151A23"/>
+          <w:sz w:val="22"/>
+        </w:rPr>
+        <w:t>Result → Decision → Simulate → Approve → Apply → Measure</w:t>
       </w:r>
       <w:r>
         <w:rPr>
@@ -3331,7 +3761,7 @@
           <w:color w:val="151A23"/>
           <w:sz w:val="22"/>
         </w:rPr>
-        <w:t xml:space="preserve">Owned by a </w:t>
+        <w:t xml:space="preserve">On </w:t>
       </w:r>
       <w:r>
         <w:rPr>
@@ -3341,7 +3771,7 @@
           <w:color w:val="151A23"/>
           <w:sz w:val="22"/>
         </w:rPr>
-        <w:t>System</w:t>
+        <w:t>one</w:t>
       </w:r>
       <w:r>
         <w:rPr>
@@ -3351,7 +3781,7 @@
           <w:color w:val="151A23"/>
           <w:sz w:val="22"/>
         </w:rPr>
-        <w:t>, in Steer — not by the portfolio.</w:t>
+        <w:t xml:space="preserve"> System, in Steer — not on the whole portfolio.</w:t>
       </w:r>
     </w:p>
     <w:p>
@@ -3366,17 +3796,17 @@
           <w:color w:val="151A23"/>
           <w:sz w:val="22"/>
         </w:rPr>
-        <w:t xml:space="preserve">Gate: </w:t>
-      </w:r>
-      <w:r>
-        <w:rPr>
-          <w:rFonts w:ascii="Consolas" w:hAnsi="Consolas" w:eastAsia="Consolas"/>
-          <w:b w:val="0"/>
+        <w:t xml:space="preserve">Open only if the “value loop” switch is on </w:t>
+      </w:r>
+      <w:r>
+        <w:rPr>
+          <w:rFonts w:ascii="Calibri" w:hAnsi="Calibri" w:eastAsia="Calibri"/>
+          <w:b/>
           <w:i w:val="0"/>
-          <w:color w:val="0E6B6A"/>
-          <w:sz w:val="22"/>
-        </w:rPr>
-        <w:t>features.value_loop_v1</w:t>
+          <w:color w:val="151A23"/>
+          <w:sz w:val="22"/>
+        </w:rPr>
+        <w:t>and</w:t>
       </w:r>
       <w:r>
         <w:rPr>
@@ -3386,18 +3816,10 @@
           <w:color w:val="151A23"/>
           <w:sz w:val="22"/>
         </w:rPr>
-        <w:t xml:space="preserve"> </w:t>
-      </w:r>
-      <w:r>
-        <w:rPr>
-          <w:rFonts w:ascii="Calibri" w:hAnsi="Calibri" w:eastAsia="Calibri"/>
-          <w:b/>
-          <w:i w:val="0"/>
-          <w:color w:val="151A23"/>
-          <w:sz w:val="22"/>
-        </w:rPr>
-        <w:t>and</w:t>
-      </w:r>
+        <w:t xml:space="preserve"> this System is</w:t>
+      </w:r>
+    </w:p>
+    <w:p>
       <w:r>
         <w:rPr>
           <w:rFonts w:ascii="Calibri" w:hAnsi="Calibri" w:eastAsia="Calibri"/>
@@ -3406,29 +3828,7 @@
           <w:color w:val="151A23"/>
           <w:sz w:val="22"/>
         </w:rPr>
-        <w:t xml:space="preserve"> System activation (canary</w:t>
-      </w:r>
-    </w:p>
-    <w:p>
-      <w:r>
-        <w:rPr>
-          <w:rFonts w:ascii="Consolas" w:hAnsi="Consolas" w:eastAsia="Consolas"/>
-          <w:b w:val="0"/>
-          <w:i w:val="0"/>
-          <w:color w:val="0E6B6A"/>
-          <w:sz w:val="22"/>
-        </w:rPr>
-        <w:t>settings.experience.value_loop_canary = "v1"</w:t>
-      </w:r>
-      <w:r>
-        <w:rPr>
-          <w:rFonts w:ascii="Calibri" w:hAnsi="Calibri" w:eastAsia="Calibri"/>
-          <w:b w:val="0"/>
-          <w:i w:val="0"/>
-          <w:color w:val="151A23"/>
-          <w:sz w:val="22"/>
-        </w:rPr>
-        <w:t xml:space="preserve"> during rollout).</w:t>
+        <w:t>chosen for the trial.</w:t>
       </w:r>
     </w:p>
     <w:p>
@@ -3443,20 +3843,10 @@
           <w:color w:val="151A23"/>
           <w:sz w:val="22"/>
         </w:rPr>
-        <w:t>First actuator, deliberately bounded:</w:t>
+        <w:t>First allowed change, deliberately narrow: a guardrail adjustment, only</w:t>
       </w:r>
     </w:p>
     <w:p>
-      <w:r>
-        <w:rPr>
-          <w:rFonts w:ascii="Consolas" w:hAnsi="Consolas" w:eastAsia="Consolas"/>
-          <w:b w:val="0"/>
-          <w:i w:val="0"/>
-          <w:color w:val="0E6B6A"/>
-          <w:sz w:val="22"/>
-        </w:rPr>
-        <w:t>control_policy.guardrails.patch.v1</w:t>
-      </w:r>
       <w:r>
         <w:rPr>
           <w:rFonts w:ascii="Calibri" w:hAnsi="Calibri" w:eastAsia="Calibri"/>
@@ -3465,37 +3855,17 @@
           <w:color w:val="151A23"/>
           <w:sz w:val="22"/>
         </w:rPr>
-        <w:t xml:space="preserve">, only if the System declares it and Membrane v2 in </w:t>
-      </w:r>
-      <w:r>
-        <w:rPr>
-          <w:rFonts w:ascii="Consolas" w:hAnsi="Consolas" w:eastAsia="Consolas"/>
+        <w:t xml:space="preserve">if the System declares it and execution control allows it. Otherwise: </w:t>
+      </w:r>
+      <w:r>
+        <w:rPr>
+          <w:rFonts w:ascii="Calibri" w:hAnsi="Calibri" w:eastAsia="Calibri"/>
           <w:b w:val="0"/>
-          <w:i w:val="0"/>
-          <w:color w:val="0E6B6A"/>
-          <w:sz w:val="22"/>
-        </w:rPr>
-        <w:t>enforce</w:t>
-      </w:r>
-      <w:r>
-        <w:rPr>
-          <w:rFonts w:ascii="Calibri" w:hAnsi="Calibri" w:eastAsia="Calibri"/>
-          <w:b w:val="0"/>
-          <w:i w:val="0"/>
+          <w:i/>
           <w:color w:val="151A23"/>
           <w:sz w:val="22"/>
         </w:rPr>
-        <w:t xml:space="preserve"> allows it. Otherwise: </w:t>
-      </w:r>
-      <w:r>
-        <w:rPr>
-          <w:rFonts w:ascii="Consolas" w:hAnsi="Consolas" w:eastAsia="Consolas"/>
-          <w:b w:val="0"/>
-          <w:i w:val="0"/>
-          <w:color w:val="0E6B6A"/>
-          <w:sz w:val="22"/>
-        </w:rPr>
-        <w:t>not_configured</w:t>
+        <w:t>not configured</w:t>
       </w:r>
       <w:r>
         <w:rPr>
@@ -3520,18 +3890,10 @@
           <w:color w:val="151A23"/>
           <w:sz w:val="22"/>
         </w:rPr>
-        <w:t xml:space="preserve">Baseline = a completed Run with server provenance </w:t>
-      </w:r>
-      <w:r>
-        <w:rPr>
-          <w:rFonts w:ascii="Consolas" w:hAnsi="Consolas" w:eastAsia="Consolas"/>
-          <w:b w:val="0"/>
-          <w:i w:val="0"/>
-          <w:color w:val="0E6B6A"/>
-          <w:sz w:val="22"/>
-        </w:rPr>
-        <w:t>runtime_auto</w:t>
-      </w:r>
+        <w:t>The starting point is a real execution recorded by the server. An</w:t>
+      </w:r>
+    </w:p>
+    <w:p>
       <w:r>
         <w:rPr>
           <w:rFonts w:ascii="Calibri" w:hAnsi="Calibri" w:eastAsia="Calibri"/>
@@ -3540,10 +3902,18 @@
           <w:color w:val="151A23"/>
           <w:sz w:val="22"/>
         </w:rPr>
-        <w:t>. A</w:t>
-      </w:r>
-    </w:p>
-    <w:p>
+        <w:t xml:space="preserve">example, a trial or a hand-typed figure is </w:t>
+      </w:r>
+      <w:r>
+        <w:rPr>
+          <w:rFonts w:ascii="Calibri" w:hAnsi="Calibri" w:eastAsia="Calibri"/>
+          <w:b/>
+          <w:i w:val="0"/>
+          <w:color w:val="151A23"/>
+          <w:sz w:val="22"/>
+        </w:rPr>
+        <w:t>refused</w:t>
+      </w:r>
       <w:r>
         <w:rPr>
           <w:rFonts w:ascii="Calibri" w:hAnsi="Calibri" w:eastAsia="Calibri"/>
@@ -3552,27 +3922,7 @@
           <w:color w:val="151A23"/>
           <w:sz w:val="22"/>
         </w:rPr>
-        <w:t xml:space="preserve">seed, a canary or an operator value is </w:t>
-      </w:r>
-      <w:r>
-        <w:rPr>
-          <w:rFonts w:ascii="Calibri" w:hAnsi="Calibri" w:eastAsia="Calibri"/>
-          <w:b/>
-          <w:i w:val="0"/>
-          <w:color w:val="151A23"/>
-          <w:sz w:val="22"/>
-        </w:rPr>
-        <w:t>refused</w:t>
-      </w:r>
-      <w:r>
-        <w:rPr>
-          <w:rFonts w:ascii="Calibri" w:hAnsi="Calibri" w:eastAsia="Calibri"/>
-          <w:b w:val="0"/>
-          <w:i w:val="0"/>
-          <w:color w:val="151A23"/>
-          <w:sz w:val="22"/>
-        </w:rPr>
-        <w:t xml:space="preserve"> as baseline.</w:t>
+        <w:t>.</w:t>
       </w:r>
     </w:p>
     <w:p>
@@ -3581,13 +3931,13 @@
       </w:pPr>
       <w:r>
         <w:rPr>
-          <w:rFonts w:ascii="Consolas" w:hAnsi="Consolas" w:eastAsia="Consolas"/>
+          <w:rFonts w:ascii="Calibri" w:hAnsi="Calibri" w:eastAsia="Calibri"/>
           <w:b w:val="0"/>
-          <w:i w:val="0"/>
-          <w:color w:val="0E6B6A"/>
-          <w:sz w:val="22"/>
-        </w:rPr>
-        <w:t>simulation_is_measurement: false</w:t>
+          <w:i/>
+          <w:color w:val="151A23"/>
+          <w:sz w:val="22"/>
+        </w:rPr>
+        <w:t>A simulation is not a measurement.</w:t>
       </w:r>
       <w:r>
         <w:rPr>
@@ -3597,10 +3947,20 @@
           <w:color w:val="151A23"/>
           <w:sz w:val="22"/>
         </w:rPr>
-        <w:t xml:space="preserve"> everywhere. A measurement closes the</w:t>
+        <w:t xml:space="preserve"> We close only if an execution</w:t>
       </w:r>
     </w:p>
     <w:p>
+      <w:r>
+        <w:rPr>
+          <w:rFonts w:ascii="Calibri" w:hAnsi="Calibri" w:eastAsia="Calibri"/>
+          <w:b/>
+          <w:i w:val="0"/>
+          <w:color w:val="151A23"/>
+          <w:sz w:val="22"/>
+        </w:rPr>
+        <w:t>after</w:t>
+      </w:r>
       <w:r>
         <w:rPr>
           <w:rFonts w:ascii="Calibri" w:hAnsi="Calibri" w:eastAsia="Calibri"/>
@@ -3609,7 +3969,7 @@
           <w:color w:val="151A23"/>
           <w:sz w:val="22"/>
         </w:rPr>
-        <w:t>scenario only on a really observed post-action Run.</w:t>
+        <w:t xml:space="preserve"> the change has been observed.</w:t>
       </w:r>
     </w:p>
     <w:p>
@@ -3650,13 +4010,85 @@
     <w:p>
       <w:r>
         <w:rPr>
+          <w:rFonts w:ascii="Calibri" w:hAnsi="Calibri" w:eastAsia="Calibri"/>
+          <w:b w:val="0"/>
+          <w:i w:val="0"/>
+          <w:color w:val="151A23"/>
+          <w:sz w:val="22"/>
+        </w:rPr>
+        <w:t xml:space="preserve">The older policy screen still exists. The “levers / what if” preview is </w:t>
+      </w:r>
+      <w:r>
+        <w:rPr>
+          <w:rFonts w:ascii="Calibri" w:hAnsi="Calibri" w:eastAsia="Calibri"/>
+          <w:b/>
+          <w:i w:val="0"/>
+          <w:color w:val="151A23"/>
+          <w:sz w:val="22"/>
+        </w:rPr>
+        <w:t>off</w:t>
+      </w:r>
+      <w:r>
+        <w:rPr>
+          <w:rFonts w:ascii="Calibri" w:hAnsi="Calibri" w:eastAsia="Calibri"/>
+          <w:b w:val="0"/>
+          <w:i w:val="0"/>
+          <w:color w:val="151A23"/>
+          <w:sz w:val="22"/>
+        </w:rPr>
+        <w:t xml:space="preserve">. Do not promise a live universal impact preview: it is </w:t>
+      </w:r>
+      <w:r>
+        <w:rPr>
+          <w:rFonts w:ascii="Calibri" w:hAnsi="Calibri" w:eastAsia="Calibri"/>
+          <w:b/>
+          <w:i w:val="0"/>
+          <w:color w:val="151A23"/>
+          <w:sz w:val="22"/>
+        </w:rPr>
+        <w:t>planned</w:t>
+      </w:r>
+      <w:r>
+        <w:rPr>
+          <w:rFonts w:ascii="Calibri" w:hAnsi="Calibri" w:eastAsia="Calibri"/>
+          <w:b w:val="0"/>
+          <w:i w:val="0"/>
+          <w:color w:val="151A23"/>
+          <w:sz w:val="22"/>
+        </w:rPr>
+        <w:t>, not wired.</w:t>
+      </w:r>
+    </w:p>
+    <w:p>
+      <w:r>
+        <w:rPr>
+          <w:rFonts w:ascii="Calibri" w:hAnsi="Calibri" w:eastAsia="Calibri"/>
+          <w:b w:val="0"/>
+          <w:i/>
+          <w:color w:val="151A23"/>
+          <w:sz w:val="22"/>
+        </w:rPr>
+        <w:t>Technical note:</w:t>
+      </w:r>
+      <w:r>
+        <w:rPr>
+          <w:rFonts w:ascii="Calibri" w:hAnsi="Calibri" w:eastAsia="Calibri"/>
+          <w:b w:val="0"/>
+          <w:i w:val="0"/>
+          <w:color w:val="151A23"/>
+          <w:sz w:val="22"/>
+        </w:rPr>
+        <w:t xml:space="preserve"> switches </w:t>
+      </w:r>
+      <w:r>
+        <w:rPr>
           <w:rFonts w:ascii="Consolas" w:hAnsi="Consolas" w:eastAsia="Consolas"/>
           <w:b w:val="0"/>
           <w:i w:val="0"/>
           <w:color w:val="0E6B6A"/>
           <w:sz w:val="22"/>
         </w:rPr>
-        <w:t>/steering</w:t>
+        <w:t>value_loop_v1</w:t>
       </w:r>
       <w:r>
         <w:rPr>
@@ -3666,27 +4098,7 @@
           <w:color w:val="151A23"/>
           <w:sz w:val="22"/>
         </w:rPr>
-        <w:t xml:space="preserve"> (legacy page) still CRUDs policies. The “levers / what-if” preview is </w:t>
-      </w:r>
-      <w:r>
-        <w:rPr>
-          <w:rFonts w:ascii="Calibri" w:hAnsi="Calibri" w:eastAsia="Calibri"/>
-          <w:b/>
-          <w:i w:val="0"/>
-          <w:color w:val="151A23"/>
-          <w:sz w:val="22"/>
-        </w:rPr>
-        <w:t>off</w:t>
-      </w:r>
-      <w:r>
-        <w:rPr>
-          <w:rFonts w:ascii="Calibri" w:hAnsi="Calibri" w:eastAsia="Calibri"/>
-          <w:b w:val="0"/>
-          <w:i w:val="0"/>
-          <w:color w:val="151A23"/>
-          <w:sz w:val="22"/>
-        </w:rPr>
-        <w:t xml:space="preserve">. </w:t>
+        <w:t xml:space="preserve"> + System canary; actuator </w:t>
       </w:r>
       <w:r>
         <w:rPr>
@@ -3696,7 +4108,7 @@
           <w:color w:val="0E6B6A"/>
           <w:sz w:val="22"/>
         </w:rPr>
-        <w:t>POST /hypervisor/what-if</w:t>
+        <w:t>control_policy.guardrails.patch.v1</w:t>
       </w:r>
       <w:r>
         <w:rPr>
@@ -3706,7 +4118,7 @@
           <w:color w:val="151A23"/>
           <w:sz w:val="22"/>
         </w:rPr>
-        <w:t xml:space="preserve"> and </w:t>
+        <w:t xml:space="preserve">; what-if </w:t>
       </w:r>
       <w:r>
         <w:rPr>
@@ -3716,7 +4128,7 @@
           <w:color w:val="0E6B6A"/>
           <w:sz w:val="22"/>
         </w:rPr>
-        <w:t>POST /control-plane/simulate</w:t>
+        <w:t>not_configured</w:t>
       </w:r>
       <w:r>
         <w:rPr>
@@ -3726,67 +4138,7 @@
           <w:color w:val="151A23"/>
           <w:sz w:val="22"/>
         </w:rPr>
-        <w:t xml:space="preserve"> return </w:t>
-      </w:r>
-      <w:r>
-        <w:rPr>
-          <w:rFonts w:ascii="Consolas" w:hAnsi="Consolas" w:eastAsia="Consolas"/>
-          <w:b w:val="0"/>
-          <w:i w:val="0"/>
-          <w:color w:val="0E6B6A"/>
-          <w:sz w:val="22"/>
-        </w:rPr>
-        <w:t>not_configured</w:t>
-      </w:r>
-      <w:r>
-        <w:rPr>
-          <w:rFonts w:ascii="Calibri" w:hAnsi="Calibri" w:eastAsia="Calibri"/>
-          <w:b w:val="0"/>
-          <w:i w:val="0"/>
-          <w:color w:val="151A23"/>
-          <w:sz w:val="22"/>
-        </w:rPr>
-        <w:t xml:space="preserve"> and point to </w:t>
-      </w:r>
-      <w:r>
-        <w:rPr>
-          <w:rFonts w:ascii="Consolas" w:hAnsi="Consolas" w:eastAsia="Consolas"/>
-          <w:b w:val="0"/>
-          <w:i w:val="0"/>
-          <w:color w:val="0E6B6A"/>
-          <w:sz w:val="22"/>
-        </w:rPr>
-        <w:t>/systems/{id}/value-loop</w:t>
-      </w:r>
-      <w:r>
-        <w:rPr>
-          <w:rFonts w:ascii="Calibri" w:hAnsi="Calibri" w:eastAsia="Calibri"/>
-          <w:b w:val="0"/>
-          <w:i w:val="0"/>
-          <w:color w:val="151A23"/>
-          <w:sz w:val="22"/>
-        </w:rPr>
-        <w:t xml:space="preserve">. Do not promise a universal impact preview (&lt; 300 ms): it is </w:t>
-      </w:r>
-      <w:r>
-        <w:rPr>
-          <w:rFonts w:ascii="Calibri" w:hAnsi="Calibri" w:eastAsia="Calibri"/>
-          <w:b/>
-          <w:i w:val="0"/>
-          <w:color w:val="151A23"/>
-          <w:sz w:val="22"/>
-        </w:rPr>
-        <w:t>planned</w:t>
-      </w:r>
-      <w:r>
-        <w:rPr>
-          <w:rFonts w:ascii="Calibri" w:hAnsi="Calibri" w:eastAsia="Calibri"/>
-          <w:b w:val="0"/>
-          <w:i w:val="0"/>
-          <w:color w:val="151A23"/>
-          <w:sz w:val="22"/>
-        </w:rPr>
-        <w:t>, the component is not wired.</w:t>
+        <w:t>.</w:t>
       </w:r>
     </w:p>
     <w:p>
@@ -3801,7 +4153,7 @@
           <w:color w:val="0B2545"/>
           <w:sz w:val="26"/>
         </w:rPr>
-        <w:t>4.3 Human approval in Work</w:t>
+        <w:t>4.3 Human approval in the application</w:t>
       </w:r>
     </w:p>
     <w:p>
@@ -3813,7 +4165,7 @@
           <w:color w:val="151A23"/>
           <w:sz w:val="22"/>
         </w:rPr>
-        <w:t xml:space="preserve">In a published application (Studio), a gate is an </w:t>
+        <w:t xml:space="preserve">In a published application (Studio), an approval request is an </w:t>
       </w:r>
       <w:r>
         <w:rPr>
@@ -3833,47 +4185,7 @@
           <w:color w:val="151A23"/>
           <w:sz w:val="22"/>
         </w:rPr>
-        <w:t>. The model cannot accept in the person’s place (</w:t>
-      </w:r>
-      <w:r>
-        <w:rPr>
-          <w:rFonts w:ascii="Consolas" w:hAnsi="Consolas" w:eastAsia="Consolas"/>
-          <w:b w:val="0"/>
-          <w:i w:val="0"/>
-          <w:color w:val="0E6B6A"/>
-          <w:sz w:val="22"/>
-        </w:rPr>
-        <w:t>POST /assistant/decisions</w:t>
-      </w:r>
-      <w:r>
-        <w:rPr>
-          <w:rFonts w:ascii="Calibri" w:hAnsi="Calibri" w:eastAsia="Calibri"/>
-          <w:b w:val="0"/>
-          <w:i w:val="0"/>
-          <w:color w:val="151A23"/>
-          <w:sz w:val="22"/>
-        </w:rPr>
-        <w:t xml:space="preserve"> requires the UI action and the observed id). </w:t>
-      </w:r>
-      <w:r>
-        <w:rPr>
-          <w:rFonts w:ascii="Consolas" w:hAnsi="Consolas" w:eastAsia="Consolas"/>
-          <w:b w:val="0"/>
-          <w:i w:val="0"/>
-          <w:color w:val="0E6B6A"/>
-          <w:sz w:val="22"/>
-        </w:rPr>
-        <w:t>/steering/review-queue</w:t>
-      </w:r>
-      <w:r>
-        <w:rPr>
-          <w:rFonts w:ascii="Calibri" w:hAnsi="Calibri" w:eastAsia="Calibri"/>
-          <w:b w:val="0"/>
-          <w:i w:val="0"/>
-          <w:color w:val="151A23"/>
-          <w:sz w:val="22"/>
-        </w:rPr>
-        <w:t xml:space="preserve"> handles evaluation reviews. These acts carry human provenance in the audit.</w:t>
+        <w:t>. The model cannot click in the person’s place. A review queue handles quality controls. These acts carry human provenance in the log.</w:t>
       </w:r>
     </w:p>
     <w:p>
@@ -4050,7 +4362,7 @@
                 <w:color w:val="151A23"/>
                 <w:sz w:val="18"/>
               </w:rPr>
-              <w:t>Each System serves a Capability, not an orphan prompt</w:t>
+              <w:t>Each System serves a business capability, not an orphan prompt</w:t>
             </w:r>
           </w:p>
         </w:tc>
@@ -4061,43 +4373,13 @@
           <w:p>
             <w:r>
               <w:rPr>
-                <w:rFonts w:ascii="Consolas" w:hAnsi="Consolas" w:eastAsia="Consolas"/>
-                <w:b w:val="0"/>
-                <w:i w:val="0"/>
-                <w:color w:val="0E6B6A"/>
-                <w:sz w:val="18"/>
-              </w:rPr>
-              <w:t>/capabilities</w:t>
-            </w:r>
-            <w:r>
-              <w:rPr>
                 <w:rFonts w:ascii="Calibri" w:hAnsi="Calibri" w:eastAsia="Calibri"/>
                 <w:b w:val="0"/>
                 <w:i w:val="0"/>
                 <w:color w:val="151A23"/>
                 <w:sz w:val="18"/>
               </w:rPr>
-              <w:t xml:space="preserve">, </w:t>
-            </w:r>
-            <w:r>
-              <w:rPr>
-                <w:rFonts w:ascii="Consolas" w:hAnsi="Consolas" w:eastAsia="Consolas"/>
-                <w:b w:val="0"/>
-                <w:i w:val="0"/>
-                <w:color w:val="0E6B6A"/>
-                <w:sz w:val="18"/>
-              </w:rPr>
-              <w:t>/systems</w:t>
-            </w:r>
-            <w:r>
-              <w:rPr>
-                <w:rFonts w:ascii="Calibri" w:hAnsi="Calibri" w:eastAsia="Calibri"/>
-                <w:b w:val="0"/>
-                <w:i w:val="0"/>
-                <w:color w:val="151A23"/>
-                <w:sz w:val="18"/>
-              </w:rPr>
-              <w:t>, Work</w:t>
+              <w:t>Capabilities, Systems, Work</w:t>
             </w:r>
           </w:p>
         </w:tc>
@@ -4133,7 +4415,7 @@
                 <w:color w:val="151A23"/>
                 <w:sz w:val="18"/>
               </w:rPr>
-              <w:t xml:space="preserve">What the business consumes is an </w:t>
+              <w:t xml:space="preserve">What the business uses is an </w:t>
             </w:r>
             <w:r>
               <w:rPr>
@@ -4143,7 +4425,7 @@
                 <w:color w:val="151A23"/>
                 <w:sz w:val="18"/>
               </w:rPr>
-              <w:t>Experience</w:t>
+              <w:t>application</w:t>
             </w:r>
             <w:r>
               <w:rPr>
@@ -4164,33 +4446,13 @@
           <w:p>
             <w:r>
               <w:rPr>
-                <w:rFonts w:ascii="Consolas" w:hAnsi="Consolas" w:eastAsia="Consolas"/>
-                <w:b w:val="0"/>
-                <w:i w:val="0"/>
-                <w:color w:val="0E6B6A"/>
-                <w:sz w:val="18"/>
-              </w:rPr>
-              <w:t>/create/apps</w:t>
-            </w:r>
-            <w:r>
-              <w:rPr>
                 <w:rFonts w:ascii="Calibri" w:hAnsi="Calibri" w:eastAsia="Calibri"/>
                 <w:b w:val="0"/>
                 <w:i w:val="0"/>
                 <w:color w:val="151A23"/>
                 <w:sz w:val="18"/>
               </w:rPr>
-              <w:t xml:space="preserve"> → </w:t>
-            </w:r>
-            <w:r>
-              <w:rPr>
-                <w:rFonts w:ascii="Consolas" w:hAnsi="Consolas" w:eastAsia="Consolas"/>
-                <w:b w:val="0"/>
-                <w:i w:val="0"/>
-                <w:color w:val="0E6B6A"/>
-                <w:sz w:val="18"/>
-              </w:rPr>
-              <w:t>/work/:slug</w:t>
+              <w:t>Create an app → Work</w:t>
             </w:r>
           </w:p>
         </w:tc>
@@ -4226,7 +4488,7 @@
                 <w:color w:val="151A23"/>
                 <w:sz w:val="18"/>
               </w:rPr>
-              <w:t>Every answer has a Run, optional cost, context, lineage</w:t>
+              <w:t>Every answer has an execution, optional cost, context, lineage</w:t>
             </w:r>
           </w:p>
         </w:tc>
@@ -4237,23 +4499,13 @@
           <w:p>
             <w:r>
               <w:rPr>
-                <w:rFonts w:ascii="Consolas" w:hAnsi="Consolas" w:eastAsia="Consolas"/>
-                <w:b w:val="0"/>
-                <w:i w:val="0"/>
-                <w:color w:val="0E6B6A"/>
-                <w:sz w:val="18"/>
-              </w:rPr>
-              <w:t>/runs/:id</w:t>
-            </w:r>
-            <w:r>
-              <w:rPr>
                 <w:rFonts w:ascii="Calibri" w:hAnsi="Calibri" w:eastAsia="Calibri"/>
                 <w:b w:val="0"/>
                 <w:i w:val="0"/>
                 <w:color w:val="151A23"/>
                 <w:sz w:val="18"/>
               </w:rPr>
-              <w:t>, conversation “Action evidence”</w:t>
+              <w:t>Execution sheet, conversation “Action evidence”</w:t>
             </w:r>
           </w:p>
         </w:tc>
@@ -4289,7 +4541,7 @@
                 <w:color w:val="151A23"/>
                 <w:sz w:val="18"/>
               </w:rPr>
-              <w:t>Policies, IAM, audit, Membrane — never “prompt only”</w:t>
+              <w:t>Rules, access rights, log, execution control — never “prompt only”</w:t>
             </w:r>
           </w:p>
         </w:tc>
@@ -4300,33 +4552,13 @@
           <w:p>
             <w:r>
               <w:rPr>
-                <w:rFonts w:ascii="Consolas" w:hAnsi="Consolas" w:eastAsia="Consolas"/>
-                <w:b w:val="0"/>
-                <w:i w:val="0"/>
-                <w:color w:val="0E6B6A"/>
-                <w:sz w:val="18"/>
-              </w:rPr>
-              <w:t>/governance/audit</w:t>
-            </w:r>
-            <w:r>
-              <w:rPr>
                 <w:rFonts w:ascii="Calibri" w:hAnsi="Calibri" w:eastAsia="Calibri"/>
                 <w:b w:val="0"/>
                 <w:i w:val="0"/>
                 <w:color w:val="151A23"/>
                 <w:sz w:val="18"/>
               </w:rPr>
-              <w:t xml:space="preserve">, </w:t>
-            </w:r>
-            <w:r>
-              <w:rPr>
-                <w:rFonts w:ascii="Consolas" w:hAnsi="Consolas" w:eastAsia="Consolas"/>
-                <w:b w:val="0"/>
-                <w:i w:val="0"/>
-                <w:color w:val="0E6B6A"/>
-                <w:sz w:val="18"/>
-              </w:rPr>
-              <w:t>/governance/access</w:t>
+              <w:t>Audit, access</w:t>
             </w:r>
           </w:p>
         </w:tc>
@@ -4383,23 +4615,13 @@
           <w:p>
             <w:r>
               <w:rPr>
-                <w:rFonts w:ascii="Consolas" w:hAnsi="Consolas" w:eastAsia="Consolas"/>
-                <w:b w:val="0"/>
-                <w:i w:val="0"/>
-                <w:color w:val="0E6B6A"/>
-                <w:sz w:val="18"/>
-              </w:rPr>
-              <w:t>/hypervisor</w:t>
-            </w:r>
-            <w:r>
-              <w:rPr>
                 <w:rFonts w:ascii="Calibri" w:hAnsi="Calibri" w:eastAsia="Calibri"/>
                 <w:b w:val="0"/>
                 <w:i w:val="0"/>
                 <w:color w:val="151A23"/>
                 <w:sz w:val="18"/>
               </w:rPr>
-              <w:t xml:space="preserve"> + the System value loop</w:t>
+              <w:t>Hypervisor + the System’s pilot screen</w:t>
             </w:r>
           </w:p>
         </w:tc>
@@ -4549,7 +4771,7 @@
           <w:color w:val="151A23"/>
           <w:sz w:val="22"/>
         </w:rPr>
-        <w:t>contracts, permissions and gates. It can start an authorized action; it cannot invent a right.</w:t>
+        <w:t>rules, rights and approvals. It can start an authorized action; it cannot invent a right.</w:t>
       </w:r>
     </w:p>
     <w:p>
@@ -4564,7 +4786,7 @@
           <w:color w:val="151A23"/>
           <w:sz w:val="22"/>
         </w:rPr>
-        <w:t>Economics is not a chrome badge.</w:t>
+        <w:t>Economics is not a decorative badge.</w:t>
       </w:r>
       <w:r>
         <w:rPr>
@@ -4574,7 +4796,19 @@
           <w:color w:val="151A23"/>
           <w:sz w:val="22"/>
         </w:rPr>
-        <w:t xml:space="preserve"> The five </w:t>
+        <w:t xml:space="preserve"> The five **operational</w:t>
+      </w:r>
+    </w:p>
+    <w:p>
+      <w:r>
+        <w:rPr>
+          <w:rFonts w:ascii="Calibri" w:hAnsi="Calibri" w:eastAsia="Calibri"/>
+          <w:b w:val="0"/>
+          <w:i w:val="0"/>
+          <w:color w:val="151A23"/>
+          <w:sz w:val="22"/>
+        </w:rPr>
+        <w:t>objective</w:t>
       </w:r>
       <w:r>
         <w:rPr>
@@ -4584,10 +4818,8 @@
           <w:color w:val="151A23"/>
           <w:sz w:val="22"/>
         </w:rPr>
-        <w:t>operational objective</w:t>
-      </w:r>
-    </w:p>
-    <w:p>
+        <w:t xml:space="preserve"> indicators are not attested ROI. The value loop owns economic measurements. “Hours / money saved” remains a </w:t>
+      </w:r>
       <w:r>
         <w:rPr>
           <w:rFonts w:ascii="Calibri" w:hAnsi="Calibri" w:eastAsia="Calibri"/>
@@ -4596,27 +4828,7 @@
           <w:color w:val="151A23"/>
           <w:sz w:val="22"/>
         </w:rPr>
-        <w:t xml:space="preserve">metrics (adoption) are not attested ROI. The value loop owns economic measurements. The “hours / money saved” gap (O5) remains a documented </w:t>
-      </w:r>
-      <w:r>
-        <w:rPr>
-          <w:rFonts w:ascii="Calibri" w:hAnsi="Calibri" w:eastAsia="Calibri"/>
-          <w:b/>
-          <w:i w:val="0"/>
-          <w:color w:val="151A23"/>
-          <w:sz w:val="22"/>
-        </w:rPr>
-        <w:t>acceptance hole</w:t>
-      </w:r>
-      <w:r>
-        <w:rPr>
-          <w:rFonts w:ascii="Calibri" w:hAnsi="Calibri" w:eastAsia="Calibri"/>
-          <w:b w:val="0"/>
-          <w:i w:val="0"/>
-          <w:color w:val="151A23"/>
-          <w:sz w:val="22"/>
-        </w:rPr>
-        <w:t>.</w:t>
+        <w:t>gap**: we have not proven it yet.</w:t>
       </w:r>
     </w:p>
     <w:p>
@@ -4641,7 +4853,7 @@
           <w:color w:val="151A23"/>
           <w:sz w:val="22"/>
         </w:rPr>
-        <w:t xml:space="preserve"> One actuator, a Membrane in enforce, a</w:t>
+        <w:t xml:space="preserve"> One allowed change type, execution</w:t>
       </w:r>
     </w:p>
     <w:p>
@@ -4653,7 +4865,7 @@
           <w:color w:val="151A23"/>
           <w:sz w:val="22"/>
         </w:rPr>
-        <w:t>human on the gates. We industrialize control as much as execution.</w:t>
+        <w:t>control, a human on approvals. We industrialize control as much as execution.</w:t>
       </w:r>
     </w:p>
     <w:p>
@@ -4837,7 +5049,7 @@
                 <w:color w:val="151A23"/>
                 <w:sz w:val="18"/>
               </w:rPr>
-              <w:t>Adoption experience</w:t>
+              <w:t>Business welcome path</w:t>
             </w:r>
           </w:p>
         </w:tc>
@@ -4854,17 +5066,17 @@
                 <w:color w:val="151A23"/>
                 <w:sz w:val="18"/>
               </w:rPr>
-              <w:t xml:space="preserve">Code shipped behind </w:t>
+              <w:t xml:space="preserve">Code shipped, </w:t>
             </w:r>
             <w:r>
               <w:rPr>
-                <w:rFonts w:ascii="Consolas" w:hAnsi="Consolas" w:eastAsia="Consolas"/>
-                <w:b w:val="0"/>
+                <w:rFonts w:ascii="Calibri" w:hAnsi="Calibri" w:eastAsia="Calibri"/>
+                <w:b/>
                 <w:i w:val="0"/>
-                <w:color w:val="0E6B6A"/>
+                <w:color w:val="151A23"/>
                 <w:sz w:val="18"/>
               </w:rPr>
-              <w:t>settings.features.adoption_experience_v1</w:t>
+              <w:t>off by default</w:t>
             </w:r>
             <w:r>
               <w:rPr>
@@ -4874,27 +5086,7 @@
                 <w:color w:val="151A23"/>
                 <w:sz w:val="18"/>
               </w:rPr>
-              <w:t xml:space="preserve"> (</w:t>
-            </w:r>
-            <w:r>
-              <w:rPr>
-                <w:rFonts w:ascii="Calibri" w:hAnsi="Calibri" w:eastAsia="Calibri"/>
-                <w:b/>
-                <w:i w:val="0"/>
-                <w:color w:val="151A23"/>
-                <w:sz w:val="18"/>
-              </w:rPr>
-              <w:t>off</w:t>
-            </w:r>
-            <w:r>
-              <w:rPr>
-                <w:rFonts w:ascii="Calibri" w:hAnsi="Calibri" w:eastAsia="Calibri"/>
-                <w:b w:val="0"/>
-                <w:i w:val="0"/>
-                <w:color w:val="151A23"/>
-                <w:sz w:val="18"/>
-              </w:rPr>
-              <w:t xml:space="preserve"> by default)</w:t>
+              <w:t xml:space="preserve"> — not yet user-validated</w:t>
             </w:r>
           </w:p>
         </w:tc>
@@ -4913,7 +5105,7 @@
                 <w:color w:val="151A23"/>
                 <w:sz w:val="18"/>
               </w:rPr>
-              <w:t>Work / Experiences</w:t>
+              <w:t>Work / applications</w:t>
             </w:r>
           </w:p>
         </w:tc>
@@ -4924,23 +5116,13 @@
           <w:p>
             <w:r>
               <w:rPr>
-                <w:rFonts w:ascii="Consolas" w:hAnsi="Consolas" w:eastAsia="Consolas"/>
-                <w:b w:val="0"/>
-                <w:i w:val="0"/>
-                <w:color w:val="0E6B6A"/>
-                <w:sz w:val="18"/>
-              </w:rPr>
-              <w:t>experience_v1</w:t>
-            </w:r>
-            <w:r>
-              <w:rPr>
                 <w:rFonts w:ascii="Calibri" w:hAnsi="Calibri" w:eastAsia="Calibri"/>
                 <w:b w:val="0"/>
                 <w:i w:val="0"/>
                 <w:color w:val="151A23"/>
                 <w:sz w:val="18"/>
               </w:rPr>
-              <w:t xml:space="preserve"> — Work/runtime contract; “integrated” ≠ production-accepted</w:t>
+              <w:t>The business can work in a published application; “integrated” ≠ production-accepted</w:t>
             </w:r>
           </w:p>
         </w:tc>
@@ -4970,13 +5152,13 @@
           <w:p>
             <w:r>
               <w:rPr>
-                <w:rFonts w:ascii="Consolas" w:hAnsi="Consolas" w:eastAsia="Consolas"/>
+                <w:rFonts w:ascii="Calibri" w:hAnsi="Calibri" w:eastAsia="Calibri"/>
                 <w:b w:val="0"/>
                 <w:i w:val="0"/>
-                <w:color w:val="0E6B6A"/>
+                <w:color w:val="151A23"/>
                 <w:sz w:val="18"/>
               </w:rPr>
-              <w:t>/help/{start,sources,systems,runs,value}</w:t>
+              <w:t>Start, sources, Systems, executions, value</w:t>
             </w:r>
           </w:p>
         </w:tc>
@@ -4995,7 +5177,7 @@
                 <w:color w:val="151A23"/>
                 <w:sz w:val="18"/>
               </w:rPr>
-              <w:t>NorthForge path</w:t>
+              <w:t>Guided example (NorthForge)</w:t>
             </w:r>
           </w:p>
         </w:tc>
@@ -5006,23 +5188,13 @@
           <w:p>
             <w:r>
               <w:rPr>
-                <w:rFonts w:ascii="Consolas" w:hAnsi="Consolas" w:eastAsia="Consolas"/>
-                <w:b w:val="0"/>
-                <w:i w:val="0"/>
-                <w:color w:val="0E6B6A"/>
-                <w:sz w:val="18"/>
-              </w:rPr>
-              <w:t>/work/getting-started</w:t>
-            </w:r>
-            <w:r>
-              <w:rPr>
                 <w:rFonts w:ascii="Calibri" w:hAnsi="Calibri" w:eastAsia="Calibri"/>
                 <w:b w:val="0"/>
                 <w:i w:val="0"/>
                 <w:color w:val="151A23"/>
                 <w:sz w:val="18"/>
               </w:rPr>
-              <w:t xml:space="preserve"> — 4 steps, Showcase + notices collection required</w:t>
+              <w:t>Four steps, on the showcase workspace, example collection required</w:t>
             </w:r>
           </w:p>
         </w:tc>
@@ -5058,7 +5230,7 @@
                 <w:color w:val="151A23"/>
                 <w:sz w:val="18"/>
               </w:rPr>
-              <w:t>Work + Cockpit overlay, scope-bound, the model does not sign</w:t>
+              <w:t>Present in Work and Cockpit, same perimeter as the screen, the model does not sign</w:t>
             </w:r>
           </w:p>
         </w:tc>
@@ -5094,7 +5266,7 @@
                 <w:color w:val="151A23"/>
                 <w:sz w:val="18"/>
               </w:rPr>
-              <w:t>5 bounded metrics on the System — not ROI</w:t>
+              <w:t>5 bounded indicators on the System — not ROI</w:t>
             </w:r>
           </w:p>
         </w:tc>
@@ -5215,7 +5387,7 @@
                 <w:color w:val="151A23"/>
                 <w:sz w:val="18"/>
               </w:rPr>
-              <w:t>Flag retirement</w:t>
+              <w:t>Default / retirement</w:t>
             </w:r>
           </w:p>
         </w:tc>
@@ -5232,7 +5404,7 @@
                 <w:color w:val="151A23"/>
                 <w:sz w:val="18"/>
               </w:rPr>
-              <w:t xml:space="preserve">Sponsor sequence (pilot → default → remove) — </w:t>
+              <w:t xml:space="preserve">Sponsor sequence (trial → default → remove) — </w:t>
             </w:r>
             <w:r>
               <w:rPr>
@@ -5402,7 +5574,7 @@
                 <w:color w:val="151A23"/>
                 <w:sz w:val="18"/>
               </w:rPr>
-              <w:t>IAM role</w:t>
+              <w:t>Access rights</w:t>
             </w:r>
           </w:p>
         </w:tc>
@@ -5419,7 +5591,7 @@
                 <w:color w:val="151A23"/>
                 <w:sz w:val="18"/>
               </w:rPr>
-              <w:t>Workspace rights</w:t>
+              <w:t>Rights in the workspace</w:t>
             </w:r>
           </w:p>
         </w:tc>
@@ -5503,103 +5675,13 @@
           <w:p>
             <w:r>
               <w:rPr>
-                <w:rFonts w:ascii="Consolas" w:hAnsi="Consolas" w:eastAsia="Consolas"/>
-                <w:b w:val="0"/>
-                <w:i w:val="0"/>
-                <w:color w:val="0E6B6A"/>
-                <w:sz w:val="18"/>
-              </w:rPr>
-              <w:t>builder</w:t>
-            </w:r>
-            <w:r>
-              <w:rPr>
                 <w:rFonts w:ascii="Calibri" w:hAnsi="Calibri" w:eastAsia="Calibri"/>
                 <w:b w:val="0"/>
                 <w:i w:val="0"/>
                 <w:color w:val="151A23"/>
                 <w:sz w:val="18"/>
               </w:rPr>
-              <w:t xml:space="preserve"> / </w:t>
-            </w:r>
-            <w:r>
-              <w:rPr>
-                <w:rFonts w:ascii="Consolas" w:hAnsi="Consolas" w:eastAsia="Consolas"/>
-                <w:b w:val="0"/>
-                <w:i w:val="0"/>
-                <w:color w:val="0E6B6A"/>
-                <w:sz w:val="18"/>
-              </w:rPr>
-              <w:t>operator</w:t>
-            </w:r>
-            <w:r>
-              <w:rPr>
-                <w:rFonts w:ascii="Calibri" w:hAnsi="Calibri" w:eastAsia="Calibri"/>
-                <w:b w:val="0"/>
-                <w:i w:val="0"/>
-                <w:color w:val="151A23"/>
-                <w:sz w:val="18"/>
-              </w:rPr>
-              <w:t xml:space="preserve"> / </w:t>
-            </w:r>
-            <w:r>
-              <w:rPr>
-                <w:rFonts w:ascii="Consolas" w:hAnsi="Consolas" w:eastAsia="Consolas"/>
-                <w:b w:val="0"/>
-                <w:i w:val="0"/>
-                <w:color w:val="0E6B6A"/>
-                <w:sz w:val="18"/>
-              </w:rPr>
-              <w:t>executive</w:t>
-            </w:r>
-            <w:r>
-              <w:rPr>
-                <w:rFonts w:ascii="Calibri" w:hAnsi="Calibri" w:eastAsia="Calibri"/>
-                <w:b w:val="0"/>
-                <w:i w:val="0"/>
-                <w:color w:val="151A23"/>
-                <w:sz w:val="18"/>
-              </w:rPr>
-              <w:t xml:space="preserve"> (+ provisioned </w:t>
-            </w:r>
-            <w:r>
-              <w:rPr>
-                <w:rFonts w:ascii="Consolas" w:hAnsi="Consolas" w:eastAsia="Consolas"/>
-                <w:b w:val="0"/>
-                <w:i w:val="0"/>
-                <w:color w:val="0E6B6A"/>
-                <w:sz w:val="18"/>
-              </w:rPr>
-              <w:t>demo</w:t>
-            </w:r>
-            <w:r>
-              <w:rPr>
-                <w:rFonts w:ascii="Calibri" w:hAnsi="Calibri" w:eastAsia="Calibri"/>
-                <w:b w:val="0"/>
-                <w:i w:val="0"/>
-                <w:color w:val="151A23"/>
-                <w:sz w:val="18"/>
-              </w:rPr>
-              <w:t xml:space="preserve">, </w:t>
-            </w:r>
-            <w:r>
-              <w:rPr>
-                <w:rFonts w:ascii="Consolas" w:hAnsi="Consolas" w:eastAsia="Consolas"/>
-                <w:b w:val="0"/>
-                <w:i w:val="0"/>
-                <w:color w:val="0E6B6A"/>
-                <w:sz w:val="18"/>
-              </w:rPr>
-              <w:t>portfolio</w:t>
-            </w:r>
-            <w:r>
-              <w:rPr>
-                <w:rFonts w:ascii="Calibri" w:hAnsi="Calibri" w:eastAsia="Calibri"/>
-                <w:b w:val="0"/>
-                <w:i w:val="0"/>
-                <w:color w:val="151A23"/>
-                <w:sz w:val="18"/>
-              </w:rPr>
-              <w:t>)</w:t>
+              <w:t>Build / Operate / Direct (+ demo, portfolio)</w:t>
             </w:r>
           </w:p>
         </w:tc>
@@ -5616,7 +5698,7 @@
                 <w:color w:val="151A23"/>
                 <w:sz w:val="18"/>
               </w:rPr>
-              <w:t>Cockpit density, home, economic/technical disclosure</w:t>
+              <w:t>Screen density, home, what is said in economic or technical terms</w:t>
             </w:r>
           </w:p>
         </w:tc>
@@ -5662,7 +5744,7 @@
                 <w:color w:val="151A23"/>
                 <w:sz w:val="18"/>
               </w:rPr>
-              <w:t xml:space="preserve"> (adoption)</w:t>
+              <w:t xml:space="preserve"> (welcome)</w:t>
             </w:r>
           </w:p>
         </w:tc>
@@ -5696,27 +5778,7 @@
                 <w:color w:val="151A23"/>
                 <w:sz w:val="18"/>
               </w:rPr>
-              <w:t xml:space="preserve">Tone of </w:t>
-            </w:r>
-            <w:r>
-              <w:rPr>
-                <w:rFonts w:ascii="Consolas" w:hAnsi="Consolas" w:eastAsia="Consolas"/>
-                <w:b w:val="0"/>
-                <w:i w:val="0"/>
-                <w:color w:val="0E6B6A"/>
-                <w:sz w:val="18"/>
-              </w:rPr>
-              <w:t>&lt;ck-help&gt;</w:t>
-            </w:r>
-            <w:r>
-              <w:rPr>
-                <w:rFonts w:ascii="Calibri" w:hAnsi="Calibri" w:eastAsia="Calibri"/>
-                <w:b w:val="0"/>
-                <w:i w:val="0"/>
-                <w:color w:val="151A23"/>
-                <w:sz w:val="18"/>
-              </w:rPr>
-              <w:t xml:space="preserve"> guides</w:t>
+              <w:t>Tone of the guides</w:t>
             </w:r>
           </w:p>
         </w:tc>
@@ -5733,7 +5795,7 @@
                 <w:color w:val="151A23"/>
                 <w:sz w:val="18"/>
               </w:rPr>
-              <w:t>Mode, role, entitlements</w:t>
+              <w:t>Mode, role, rights</w:t>
             </w:r>
           </w:p>
         </w:tc>
@@ -5743,43 +5805,13 @@
     <w:p>
       <w:r>
         <w:rPr>
-          <w:rFonts w:ascii="Consolas" w:hAnsi="Consolas" w:eastAsia="Consolas"/>
-          <w:b w:val="0"/>
-          <w:i w:val="0"/>
-          <w:color w:val="0E6B6A"/>
-          <w:sz w:val="22"/>
-        </w:rPr>
-        <w:t>demo</w:t>
-      </w:r>
-      <w:r>
-        <w:rPr>
           <w:rFonts w:ascii="Calibri" w:hAnsi="Calibri" w:eastAsia="Calibri"/>
           <w:b w:val="0"/>
           <w:i w:val="0"/>
           <w:color w:val="151A23"/>
           <w:sz w:val="22"/>
         </w:rPr>
-        <w:t xml:space="preserve"> mode hides providers and models (presentation-safe). </w:t>
-      </w:r>
-      <w:r>
-        <w:rPr>
-          <w:rFonts w:ascii="Consolas" w:hAnsi="Consolas" w:eastAsia="Consolas"/>
-          <w:b w:val="0"/>
-          <w:i w:val="0"/>
-          <w:color w:val="0E6B6A"/>
-          <w:sz w:val="22"/>
-        </w:rPr>
-        <w:t>portfolio</w:t>
-      </w:r>
-      <w:r>
-        <w:rPr>
-          <w:rFonts w:ascii="Calibri" w:hAnsi="Calibri" w:eastAsia="Calibri"/>
-          <w:b w:val="0"/>
-          <w:i w:val="0"/>
-          <w:color w:val="151A23"/>
-          <w:sz w:val="22"/>
-        </w:rPr>
-        <w:t xml:space="preserve"> is persisted and intentionally absent from the UI selector.</w:t>
+        <w:t>Demo mode hides providers and models (presentation-safe). Portfolio mode exists behind the scenes, intentionally absent from the selector.</w:t>
       </w:r>
     </w:p>
     <w:p>
@@ -5856,7 +5888,7 @@
                 <w:color w:val="0B2545"/>
                 <w:sz w:val="18"/>
               </w:rPr>
-              <w:t>Entry</w:t>
+              <w:t>Enters through</w:t>
             </w:r>
           </w:p>
         </w:tc>
@@ -5892,7 +5924,7 @@
                 <w:color w:val="151A23"/>
                 <w:sz w:val="18"/>
               </w:rPr>
-              <w:t>Sarah — CAIO</w:t>
+              <w:t>Sarah — AI lead</w:t>
             </w:r>
           </w:p>
         </w:tc>
@@ -5903,13 +5935,13 @@
           <w:p>
             <w:r>
               <w:rPr>
-                <w:rFonts w:ascii="Consolas" w:hAnsi="Consolas" w:eastAsia="Consolas"/>
+                <w:rFonts w:ascii="Calibri" w:hAnsi="Calibri" w:eastAsia="Calibri"/>
                 <w:b w:val="0"/>
                 <w:i w:val="0"/>
-                <w:color w:val="0E6B6A"/>
+                <w:color w:val="151A23"/>
                 <w:sz w:val="18"/>
               </w:rPr>
-              <w:t>/hypervisor</w:t>
+              <w:t>Hypervisor / Impact</w:t>
             </w:r>
           </w:p>
         </w:tc>
@@ -5945,34 +5977,7 @@
                 <w:color w:val="151A23"/>
                 <w:sz w:val="18"/>
               </w:rPr>
-              <w:t>Mehdi — Steward</w:t>
-            </w:r>
-          </w:p>
-        </w:tc>
-        <w:tc>
-          <w:tcPr>
-            <w:tcW w:type="dxa" w:w="3249"/>
-          </w:tcPr>
-          <w:p>
-            <w:r>
-              <w:rPr>
-                <w:rFonts w:ascii="Consolas" w:hAnsi="Consolas" w:eastAsia="Consolas"/>
-                <w:b w:val="0"/>
-                <w:i w:val="0"/>
-                <w:color w:val="0E6B6A"/>
-                <w:sz w:val="18"/>
-              </w:rPr>
-              <w:t>/steering</w:t>
-            </w:r>
-            <w:r>
-              <w:rPr>
-                <w:rFonts w:ascii="Calibri" w:hAnsi="Calibri" w:eastAsia="Calibri"/>
-                <w:b w:val="0"/>
-                <w:i w:val="0"/>
-                <w:color w:val="151A23"/>
-                <w:sz w:val="18"/>
-              </w:rPr>
-              <w:t xml:space="preserve"> then a System’s Steer</w:t>
+              <w:t>Mehdi — pilot</w:t>
             </w:r>
           </w:p>
         </w:tc>
@@ -5989,7 +5994,24 @@
                 <w:color w:val="151A23"/>
                 <w:sz w:val="18"/>
               </w:rPr>
-              <w:t>Envelope and policies</w:t>
+              <w:t>Pilot one System</w:t>
+            </w:r>
+          </w:p>
+        </w:tc>
+        <w:tc>
+          <w:tcPr>
+            <w:tcW w:type="dxa" w:w="3249"/>
+          </w:tcPr>
+          <w:p>
+            <w:r>
+              <w:rPr>
+                <w:rFonts w:ascii="Calibri" w:hAnsi="Calibri" w:eastAsia="Calibri"/>
+                <w:b w:val="0"/>
+                <w:i w:val="0"/>
+                <w:color w:val="151A23"/>
+                <w:sz w:val="18"/>
+              </w:rPr>
+              <w:t>Bound the rules</w:t>
             </w:r>
           </w:p>
         </w:tc>
@@ -6008,7 +6030,7 @@
                 <w:color w:val="151A23"/>
                 <w:sz w:val="18"/>
               </w:rPr>
-              <w:t>Alex — Builder</w:t>
+              <w:t>Alex — designer</w:t>
             </w:r>
           </w:p>
         </w:tc>
@@ -6019,33 +6041,13 @@
           <w:p>
             <w:r>
               <w:rPr>
-                <w:rFonts w:ascii="Consolas" w:hAnsi="Consolas" w:eastAsia="Consolas"/>
-                <w:b w:val="0"/>
-                <w:i w:val="0"/>
-                <w:color w:val="0E6B6A"/>
-                <w:sz w:val="18"/>
-              </w:rPr>
-              <w:t>/create</w:t>
-            </w:r>
-            <w:r>
-              <w:rPr>
                 <w:rFonts w:ascii="Calibri" w:hAnsi="Calibri" w:eastAsia="Calibri"/>
                 <w:b w:val="0"/>
                 <w:i w:val="0"/>
                 <w:color w:val="151A23"/>
                 <w:sz w:val="18"/>
               </w:rPr>
-              <w:t xml:space="preserve">, </w:t>
-            </w:r>
-            <w:r>
-              <w:rPr>
-                <w:rFonts w:ascii="Consolas" w:hAnsi="Consolas" w:eastAsia="Consolas"/>
-                <w:b w:val="0"/>
-                <w:i w:val="0"/>
-                <w:color w:val="0E6B6A"/>
-                <w:sz w:val="18"/>
-              </w:rPr>
-              <w:t>/systems/new</w:t>
+              <w:t>Create</w:t>
             </w:r>
           </w:p>
         </w:tc>
@@ -6081,7 +6083,7 @@
                 <w:color w:val="151A23"/>
                 <w:sz w:val="18"/>
               </w:rPr>
-              <w:t>Claire — Analyst</w:t>
+              <w:t>Claire — business</w:t>
             </w:r>
           </w:p>
         </w:tc>
@@ -6098,27 +6100,7 @@
                 <w:color w:val="151A23"/>
                 <w:sz w:val="18"/>
               </w:rPr>
-              <w:t xml:space="preserve">Work first; Cockpit </w:t>
-            </w:r>
-            <w:r>
-              <w:rPr>
-                <w:rFonts w:ascii="Consolas" w:hAnsi="Consolas" w:eastAsia="Consolas"/>
-                <w:b w:val="0"/>
-                <w:i w:val="0"/>
-                <w:color w:val="0E6B6A"/>
-                <w:sz w:val="18"/>
-              </w:rPr>
-              <w:t>/runs</w:t>
-            </w:r>
-            <w:r>
-              <w:rPr>
-                <w:rFonts w:ascii="Calibri" w:hAnsi="Calibri" w:eastAsia="Calibri"/>
-                <w:b w:val="0"/>
-                <w:i w:val="0"/>
-                <w:color w:val="151A23"/>
-                <w:sz w:val="18"/>
-              </w:rPr>
-              <w:t xml:space="preserve"> to drill</w:t>
+              <w:t>Work first; Cockpit only to drill an execution</w:t>
             </w:r>
           </w:p>
         </w:tc>
@@ -6135,7 +6117,7 @@
                 <w:color w:val="151A23"/>
                 <w:sz w:val="18"/>
               </w:rPr>
-              <w:t>Consume and trace</w:t>
+              <w:t>Use and trace</w:t>
             </w:r>
           </w:p>
         </w:tc>
@@ -6154,7 +6136,7 @@
                 <w:color w:val="151A23"/>
                 <w:sz w:val="18"/>
               </w:rPr>
-              <w:t>Léo — Curator</w:t>
+              <w:t>Léo — curator</w:t>
             </w:r>
           </w:p>
         </w:tc>
@@ -6165,13 +6147,13 @@
           <w:p>
             <w:r>
               <w:rPr>
-                <w:rFonts w:ascii="Consolas" w:hAnsi="Consolas" w:eastAsia="Consolas"/>
+                <w:rFonts w:ascii="Calibri" w:hAnsi="Calibri" w:eastAsia="Calibri"/>
                 <w:b w:val="0"/>
                 <w:i w:val="0"/>
-                <w:color w:val="0E6B6A"/>
+                <w:color w:val="151A23"/>
                 <w:sz w:val="18"/>
               </w:rPr>
-              <w:t>/knowledge</w:t>
+              <w:t>Knowledge</w:t>
             </w:r>
           </w:p>
         </w:tc>
@@ -6207,24 +6189,7 @@
                 <w:color w:val="151A23"/>
                 <w:sz w:val="18"/>
               </w:rPr>
-              <w:t>Nadia — Governance</w:t>
-            </w:r>
-          </w:p>
-        </w:tc>
-        <w:tc>
-          <w:tcPr>
-            <w:tcW w:type="dxa" w:w="3249"/>
-          </w:tcPr>
-          <w:p>
-            <w:r>
-              <w:rPr>
-                <w:rFonts w:ascii="Consolas" w:hAnsi="Consolas" w:eastAsia="Consolas"/>
-                <w:b w:val="0"/>
-                <w:i w:val="0"/>
-                <w:color w:val="0E6B6A"/>
-                <w:sz w:val="18"/>
-              </w:rPr>
-              <w:t>/governance/audit</w:t>
+              <w:t>Nadia — compliance</w:t>
             </w:r>
           </w:p>
         </w:tc>
@@ -6241,7 +6206,24 @@
                 <w:color w:val="151A23"/>
                 <w:sz w:val="18"/>
               </w:rPr>
-              <w:t>Compliance</w:t>
+              <w:t>Audit log</w:t>
+            </w:r>
+          </w:p>
+        </w:tc>
+        <w:tc>
+          <w:tcPr>
+            <w:tcW w:type="dxa" w:w="3249"/>
+          </w:tcPr>
+          <w:p>
+            <w:r>
+              <w:rPr>
+                <w:rFonts w:ascii="Calibri" w:hAnsi="Calibri" w:eastAsia="Calibri"/>
+                <w:b w:val="0"/>
+                <w:i w:val="0"/>
+                <w:color w:val="151A23"/>
+                <w:sz w:val="18"/>
+              </w:rPr>
+              <w:t>Control</w:t>
             </w:r>
           </w:p>
         </w:tc>
@@ -6257,27 +6239,7 @@
           <w:color w:val="151A23"/>
           <w:sz w:val="22"/>
         </w:rPr>
-        <w:t xml:space="preserve">Claire does not “live” in </w:t>
-      </w:r>
-      <w:r>
-        <w:rPr>
-          <w:rFonts w:ascii="Consolas" w:hAnsi="Consolas" w:eastAsia="Consolas"/>
-          <w:b w:val="0"/>
-          <w:i w:val="0"/>
-          <w:color w:val="0E6B6A"/>
-          <w:sz w:val="22"/>
-        </w:rPr>
-        <w:t>/systems/:id</w:t>
-      </w:r>
-      <w:r>
-        <w:rPr>
-          <w:rFonts w:ascii="Calibri" w:hAnsi="Calibri" w:eastAsia="Calibri"/>
-          <w:b w:val="0"/>
-          <w:i w:val="0"/>
-          <w:color w:val="151A23"/>
-          <w:sz w:val="22"/>
-        </w:rPr>
-        <w:t xml:space="preserve">. Business users consume in </w:t>
+        <w:t xml:space="preserve">Claire does not “live” in a System’s technical sheet. The business works in </w:t>
       </w:r>
       <w:r>
         <w:rPr>
@@ -6455,53 +6417,13 @@
           <w:p>
             <w:r>
               <w:rPr>
-                <w:rFonts w:ascii="Consolas" w:hAnsi="Consolas" w:eastAsia="Consolas"/>
-                <w:b w:val="0"/>
-                <w:i w:val="0"/>
-                <w:color w:val="0E6B6A"/>
-                <w:sz w:val="18"/>
-              </w:rPr>
-              <w:t>/work</w:t>
-            </w:r>
-            <w:r>
-              <w:rPr>
                 <w:rFonts w:ascii="Calibri" w:hAnsi="Calibri" w:eastAsia="Calibri"/>
                 <w:b w:val="0"/>
                 <w:i w:val="0"/>
                 <w:color w:val="151A23"/>
                 <w:sz w:val="18"/>
               </w:rPr>
-              <w:t xml:space="preserve"> → one published app → </w:t>
-            </w:r>
-            <w:r>
-              <w:rPr>
-                <w:rFonts w:ascii="Consolas" w:hAnsi="Consolas" w:eastAsia="Consolas"/>
-                <w:b w:val="0"/>
-                <w:i w:val="0"/>
-                <w:color w:val="0E6B6A"/>
-                <w:sz w:val="18"/>
-              </w:rPr>
-              <w:t>/hypervisor</w:t>
-            </w:r>
-            <w:r>
-              <w:rPr>
-                <w:rFonts w:ascii="Calibri" w:hAnsi="Calibri" w:eastAsia="Calibri"/>
-                <w:b w:val="0"/>
-                <w:i w:val="0"/>
-                <w:color w:val="151A23"/>
-                <w:sz w:val="18"/>
-              </w:rPr>
-              <w:t xml:space="preserve"> (Impact) → read measured/declared/missing → </w:t>
-            </w:r>
-            <w:r>
-              <w:rPr>
-                <w:rFonts w:ascii="Consolas" w:hAnsi="Consolas" w:eastAsia="Consolas"/>
-                <w:b w:val="0"/>
-                <w:i w:val="0"/>
-                <w:color w:val="0E6B6A"/>
-                <w:sz w:val="18"/>
-              </w:rPr>
-              <w:t>/help/value</w:t>
+              <w:t>Work → one published application → Impact → read measured / declared / missing → value help</w:t>
             </w:r>
           </w:p>
         </w:tc>
@@ -6518,7 +6440,7 @@
                 <w:color w:val="151A23"/>
                 <w:sz w:val="18"/>
               </w:rPr>
-              <w:t xml:space="preserve">30d/90d review, value-base coverage, pending decisions, one audit pass. </w:t>
+              <w:t xml:space="preserve">30d / 90d review, value-convention coverage, pending opinions, one audit pass. </w:t>
             </w:r>
             <w:r>
               <w:rPr>
@@ -6538,7 +6460,7 @@
                 <w:color w:val="151A23"/>
                 <w:sz w:val="18"/>
               </w:rPr>
-              <w:t xml:space="preserve"> “hours saved €” without a Lot 8 baseline.</w:t>
+              <w:t xml:space="preserve"> “hours saved €” without a measurement after a change.</w:t>
             </w:r>
           </w:p>
         </w:tc>
@@ -6557,7 +6479,7 @@
                 <w:color w:val="151A23"/>
                 <w:sz w:val="18"/>
               </w:rPr>
-              <w:t>Business consumer</w:t>
+              <w:t>Business user</w:t>
             </w:r>
           </w:p>
         </w:tc>
@@ -6568,23 +6490,13 @@
           <w:p>
             <w:r>
               <w:rPr>
-                <w:rFonts w:ascii="Consolas" w:hAnsi="Consolas" w:eastAsia="Consolas"/>
-                <w:b w:val="0"/>
-                <w:i w:val="0"/>
-                <w:color w:val="0E6B6A"/>
-                <w:sz w:val="18"/>
-              </w:rPr>
-              <w:t>/work</w:t>
-            </w:r>
-            <w:r>
-              <w:rPr>
                 <w:rFonts w:ascii="Calibri" w:hAnsi="Calibri" w:eastAsia="Calibri"/>
                 <w:b w:val="0"/>
                 <w:i w:val="0"/>
                 <w:color w:val="151A23"/>
                 <w:sz w:val="18"/>
               </w:rPr>
-              <w:t xml:space="preserve"> → question → open the citation → (optional) NorthForge. Persona </w:t>
+              <w:t xml:space="preserve">Work → question → open the source → (optional) guided example. Preference </w:t>
             </w:r>
             <w:r>
               <w:rPr>
@@ -6621,27 +6533,7 @@
                 <w:color w:val="151A23"/>
                 <w:sz w:val="18"/>
               </w:rPr>
-              <w:t xml:space="preserve">Daily Work; </w:t>
-            </w:r>
-            <w:r>
-              <w:rPr>
-                <w:rFonts w:ascii="Consolas" w:hAnsi="Consolas" w:eastAsia="Consolas"/>
-                <w:b w:val="0"/>
-                <w:i w:val="0"/>
-                <w:color w:val="0E6B6A"/>
-                <w:sz w:val="18"/>
-              </w:rPr>
-              <w:t>/steering/review-queue</w:t>
-            </w:r>
-            <w:r>
-              <w:rPr>
-                <w:rFonts w:ascii="Calibri" w:hAnsi="Calibri" w:eastAsia="Calibri"/>
-                <w:b w:val="0"/>
-                <w:i w:val="0"/>
-                <w:color w:val="151A23"/>
-                <w:sz w:val="18"/>
-              </w:rPr>
-              <w:t xml:space="preserve"> if assigned; Run deep link only to drill. </w:t>
+              <w:t xml:space="preserve">Daily Work; review queue if assigned; open an execution only to drill. </w:t>
             </w:r>
             <w:r>
               <w:rPr>
@@ -6687,7 +6579,7 @@
                 <w:color w:val="151A23"/>
                 <w:sz w:val="18"/>
               </w:rPr>
-              <w:t xml:space="preserve">A Studio gate </w:t>
+              <w:t xml:space="preserve">An approval in the application </w:t>
             </w:r>
             <w:r>
               <w:rPr>
@@ -6707,7 +6599,7 @@
                 <w:color w:val="151A23"/>
                 <w:sz w:val="18"/>
               </w:rPr>
-              <w:t xml:space="preserve"> a Hypervisor decision (signal) </w:t>
+              <w:t xml:space="preserve"> a Hypervisor opinion </w:t>
             </w:r>
             <w:r>
               <w:rPr>
@@ -6727,7 +6619,7 @@
                 <w:color w:val="151A23"/>
                 <w:sz w:val="18"/>
               </w:rPr>
-              <w:t xml:space="preserve"> opening Steer</w:t>
+              <w:t xml:space="preserve"> opening the pilot screen</w:t>
             </w:r>
           </w:p>
         </w:tc>
@@ -6744,14 +6636,14 @@
                 <w:color w:val="151A23"/>
                 <w:sz w:val="18"/>
               </w:rPr>
-              <w:t xml:space="preserve">Inbox: gates + review + Impact feed. One </w:t>
+              <w:t xml:space="preserve">Inbox: approvals + review + Impact queue. One </w:t>
             </w:r>
             <w:r>
               <w:rPr>
-                <w:rFonts w:ascii="Consolas" w:hAnsi="Consolas" w:eastAsia="Consolas"/>
+                <w:rFonts w:ascii="Calibri" w:hAnsi="Calibri" w:eastAsia="Calibri"/>
                 <w:b w:val="0"/>
-                <w:i w:val="0"/>
-                <w:color w:val="0E6B6A"/>
+                <w:i/>
+                <w:color w:val="151A23"/>
                 <w:sz w:val="18"/>
               </w:rPr>
               <w:t>Simulate → Measure</w:t>
@@ -6764,27 +6656,7 @@
                 <w:color w:val="151A23"/>
                 <w:sz w:val="18"/>
               </w:rPr>
-              <w:t xml:space="preserve"> scenario only if </w:t>
-            </w:r>
-            <w:r>
-              <w:rPr>
-                <w:rFonts w:ascii="Consolas" w:hAnsi="Consolas" w:eastAsia="Consolas"/>
-                <w:b w:val="0"/>
-                <w:i w:val="0"/>
-                <w:color w:val="0E6B6A"/>
-                <w:sz w:val="18"/>
-              </w:rPr>
-              <w:t>value_loop_v1</w:t>
-            </w:r>
-            <w:r>
-              <w:rPr>
-                <w:rFonts w:ascii="Calibri" w:hAnsi="Calibri" w:eastAsia="Calibri"/>
-                <w:b w:val="0"/>
-                <w:i w:val="0"/>
-                <w:color w:val="151A23"/>
-                <w:sz w:val="18"/>
-              </w:rPr>
-              <w:t xml:space="preserve"> is active on </w:t>
+              <w:t xml:space="preserve"> scenario only if the value loop is open on </w:t>
             </w:r>
             <w:r>
               <w:rPr>
@@ -7083,7 +6955,7 @@
           <w:color w:val="151A23"/>
           <w:sz w:val="22"/>
         </w:rPr>
-        <w:t>“The adoption flag = mature product” — the flag is a tap.</w:t>
+        <w:t>“The welcome path = mature product” — it is a tap, off by default.</w:t>
       </w:r>
     </w:p>
     <w:p>
@@ -7300,7 +7172,7 @@
                 <w:color w:val="151A23"/>
                 <w:sz w:val="18"/>
               </w:rPr>
-              <w:t>Accepting in the Hypervisor records a signal.</w:t>
+              <w:t>Accepting in the Hypervisor records an opinion.</w:t>
             </w:r>
           </w:p>
         </w:tc>
@@ -7317,7 +7189,7 @@
                 <w:color w:val="151A23"/>
                 <w:sz w:val="18"/>
               </w:rPr>
-              <w:t>“The Hypervisor applies the policy by itself.”</w:t>
+              <w:t>“The Hypervisor applies the rule by itself.”</w:t>
             </w:r>
           </w:p>
         </w:tc>
@@ -7336,7 +7208,7 @@
                 <w:color w:val="151A23"/>
                 <w:sz w:val="18"/>
               </w:rPr>
-              <w:t>The value loop lives on a System, behind a flag.</w:t>
+              <w:t>The value loop lives on a System, if it is open.</w:t>
             </w:r>
           </w:p>
         </w:tc>
@@ -7677,7 +7549,7 @@
           <w:color w:val="151A23"/>
           <w:sz w:val="22"/>
         </w:rPr>
-        <w:t xml:space="preserve"> — a published application, a question, a citation. </w:t>
+        <w:t xml:space="preserve"> — a published application, a question, an opened source. </w:t>
       </w:r>
       <w:r>
         <w:rPr>
@@ -7702,7 +7574,7 @@
           <w:color w:val="151A23"/>
           <w:sz w:val="22"/>
         </w:rPr>
-        <w:t>Run</w:t>
+        <w:t>One execution</w:t>
       </w:r>
       <w:r>
         <w:rPr>
@@ -7712,7 +7584,7 @@
           <w:color w:val="151A23"/>
           <w:sz w:val="22"/>
         </w:rPr>
-        <w:t xml:space="preserve"> — deep link. </w:t>
+        <w:t xml:space="preserve"> — the deep link. </w:t>
       </w:r>
       <w:r>
         <w:rPr>
@@ -7747,7 +7619,7 @@
           <w:color w:val="151A23"/>
           <w:sz w:val="22"/>
         </w:rPr>
-        <w:t xml:space="preserve"> — measured/declared legend, one pending</w:t>
+        <w:t xml:space="preserve"> — measured / declared legend, one pending</w:t>
       </w:r>
     </w:p>
     <w:p>
@@ -7769,7 +7641,7 @@
           <w:color w:val="151A23"/>
           <w:sz w:val="22"/>
         </w:rPr>
-        <w:t>Observe, then decide (signal).</w:t>
+        <w:t>Observe, then give an opinion.</w:t>
       </w:r>
     </w:p>
     <w:p>
@@ -7784,7 +7656,7 @@
           <w:color w:val="151A23"/>
           <w:sz w:val="22"/>
         </w:rPr>
-        <w:t>System Steer</w:t>
+        <w:t>Pilot one System</w:t>
       </w:r>
       <w:r>
         <w:rPr>
@@ -7794,27 +7666,7 @@
           <w:color w:val="151A23"/>
           <w:sz w:val="22"/>
         </w:rPr>
-        <w:t xml:space="preserve"> (only if </w:t>
-      </w:r>
-      <w:r>
-        <w:rPr>
-          <w:rFonts w:ascii="Consolas" w:hAnsi="Consolas" w:eastAsia="Consolas"/>
-          <w:b w:val="0"/>
-          <w:i w:val="0"/>
-          <w:color w:val="0E6B6A"/>
-          <w:sz w:val="22"/>
-        </w:rPr>
-        <w:t>value_loop_v1</w:t>
-      </w:r>
-      <w:r>
-        <w:rPr>
-          <w:rFonts w:ascii="Calibri" w:hAnsi="Calibri" w:eastAsia="Calibri"/>
-          <w:b w:val="0"/>
-          <w:i w:val="0"/>
-          <w:color w:val="151A23"/>
-          <w:sz w:val="22"/>
-        </w:rPr>
-        <w:t xml:space="preserve"> is actually on) — *Simulate</w:t>
+        <w:t xml:space="preserve"> (only if the value loop is really open) — *Simulate</w:t>
       </w:r>
     </w:p>
     <w:p>
@@ -7841,7 +7693,7 @@
           <w:color w:val="151A23"/>
           <w:sz w:val="22"/>
         </w:rPr>
-        <w:t>`/help/value`</w:t>
+        <w:t>Value help</w:t>
       </w:r>
       <w:r>
         <w:rPr>

</xml_diff>